<commit_message>
single user gitgrader update
</commit_message>
<xml_diff>
--- a/gitgrader/STUDENT_GUIDE.docx
+++ b/gitgrader/STUDENT_GUIDE.docx
@@ -2,7 +2,7 @@
 <file path=word/document.xml><?xml version="1.0" encoding="utf-8"?>
 <w:document xmlns:w="http://schemas.openxmlformats.org/wordprocessingml/2006/main" xmlns:m="http://schemas.openxmlformats.org/officeDocument/2006/math" xmlns:r="http://schemas.openxmlformats.org/officeDocument/2006/relationships" xmlns:o="urn:schemas-microsoft-com:office:office" xmlns:v="urn:schemas-microsoft-com:vml" xmlns:w10="urn:schemas-microsoft-com:office:word" xmlns:a="http://schemas.openxmlformats.org/drawingml/2006/main" xmlns:pic="http://schemas.openxmlformats.org/drawingml/2006/picture" xmlns:wp="http://schemas.openxmlformats.org/drawingml/2006/wordprocessingDrawing">
   <w:body>
-    <w:bookmarkStart w:id="38" w:name="student-guide-how-to-get-a-perfect-score"/>
+    <w:bookmarkStart w:id="44" w:name="student-guide-how-to-get-a-perfect-score"/>
     <w:p>
       <w:pPr>
         <w:pStyle w:val="Heading1"/>
@@ -19,37 +19,107 @@
         <w:t xml:space="preserve">This guide explains exactly what you need to do to get the best possible score when your work is graded by the GitHub Grading Bot.</w:t>
       </w:r>
     </w:p>
-    <w:bookmarkStart w:id="20" w:name="overview-of-grading-criteria"/>
+    <w:bookmarkStart w:id="20" w:name="two-types-of-grading"/>
     <w:p>
       <w:pPr>
         <w:pStyle w:val="Heading2"/>
       </w:pPr>
       <w:r>
+        <w:t xml:space="preserve">Two Types of Grading</w:t>
+      </w:r>
+    </w:p>
+    <w:p>
+      <w:pPr>
+        <w:pStyle w:val="FirstParagraph"/>
+      </w:pPr>
+      <w:r>
+        <w:t xml:space="preserve">The grading bot can grade your work in two different ways:</w:t>
+      </w:r>
+    </w:p>
+    <w:p>
+      <w:pPr>
+        <w:numPr>
+          <w:ilvl w:val="0"/>
+          <w:numId w:val="1001"/>
+        </w:numPr>
+        <w:pStyle w:val="Compact"/>
+      </w:pPr>
+      <w:r>
+        <w:rPr>
+          <w:bCs/>
+          <w:b/>
+        </w:rPr>
+        <w:t xml:space="preserve">Team Grading (Single Repository)</w:t>
+      </w:r>
+      <w:r>
+        <w:t xml:space="preserve">: Your work is graded within one specific repository. Maximum score:</w:t>
+      </w:r>
+      <w:r>
+        <w:t xml:space="preserve"> </w:t>
+      </w:r>
+      <w:r>
+        <w:rPr>
+          <w:bCs/>
+          <w:b/>
+        </w:rPr>
+        <w:t xml:space="preserve">100 points</w:t>
+      </w:r>
+      <w:r>
+        <w:t xml:space="preserve">.</w:t>
+      </w:r>
+    </w:p>
+    <w:p>
+      <w:pPr>
+        <w:numPr>
+          <w:ilvl w:val="0"/>
+          <w:numId w:val="1001"/>
+        </w:numPr>
+        <w:pStyle w:val="Compact"/>
+      </w:pPr>
+      <w:r>
+        <w:rPr>
+          <w:bCs/>
+          <w:b/>
+        </w:rPr>
+        <w:t xml:space="preserve">Individual/Class Grading (Multiple Repositories)</w:t>
+      </w:r>
+      <w:r>
+        <w:t xml:space="preserve">: Your work is graded across all repositories owned by your instructor. Maximum score:</w:t>
+      </w:r>
+      <w:r>
+        <w:t xml:space="preserve"> </w:t>
+      </w:r>
+      <w:r>
+        <w:rPr>
+          <w:bCs/>
+          <w:b/>
+        </w:rPr>
+        <w:t xml:space="preserve">90 points</w:t>
+      </w:r>
+      <w:r>
+        <w:t xml:space="preserve"> </w:t>
+      </w:r>
+      <w:r>
+        <w:t xml:space="preserve">(Project Board Workflow is not checked).</w:t>
+      </w:r>
+    </w:p>
+    <w:bookmarkEnd w:id="20"/>
+    <w:bookmarkStart w:id="23" w:name="overview-of-grading-criteria"/>
+    <w:p>
+      <w:pPr>
+        <w:pStyle w:val="Heading2"/>
+      </w:pPr>
+      <w:r>
         <w:t xml:space="preserve">Overview of Grading Criteria</w:t>
       </w:r>
     </w:p>
-    <w:p>
-      <w:pPr>
-        <w:pStyle w:val="FirstParagraph"/>
-      </w:pPr>
-      <w:r>
-        <w:t xml:space="preserve">Your work is graded on</w:t>
-      </w:r>
-      <w:r>
-        <w:t xml:space="preserve"> </w:t>
-      </w:r>
-      <w:r>
-        <w:rPr>
-          <w:bCs/>
-          <w:b/>
-        </w:rPr>
-        <w:t xml:space="preserve">100 points</w:t>
-      </w:r>
-      <w:r>
-        <w:t xml:space="preserve"> </w:t>
-      </w:r>
-      <w:r>
-        <w:t xml:space="preserve">total, broken down as follows:</w:t>
+    <w:bookmarkStart w:id="21" w:name="team-grading-100-points-total"/>
+    <w:p>
+      <w:pPr>
+        <w:pStyle w:val="Heading3"/>
+      </w:pPr>
+      <w:r>
+        <w:t xml:space="preserve">Team Grading (100 points total)</w:t>
       </w:r>
     </w:p>
     <w:tbl>
@@ -358,8 +428,447 @@
         </w:tc>
       </w:tr>
     </w:tbl>
-    <w:bookmarkEnd w:id="20"/>
-    <w:bookmarkStart w:id="28" w:name="step-by-step-guide-to-maximum-points"/>
+    <w:bookmarkEnd w:id="21"/>
+    <w:bookmarkStart w:id="22" w:name="individualclass-grading-90-points-total"/>
+    <w:p>
+      <w:pPr>
+        <w:pStyle w:val="Heading3"/>
+      </w:pPr>
+      <w:r>
+        <w:t xml:space="preserve">Individual/Class Grading (90 points total)</w:t>
+      </w:r>
+    </w:p>
+    <w:tbl>
+      <w:tblPr>
+        <w:tblStyle w:val="Table"/>
+        <w:tblW w:type="auto" w:w="0"/>
+        <w:tblLook w:firstRow="1" w:lastRow="0" w:firstColumn="0" w:lastColumn="0" w:noHBand="0" w:noVBand="0" w:val="0020"/>
+        <w:jc w:val="start"/>
+      </w:tblPr>
+      <w:tblGrid>
+        <w:gridCol w:w="2640"/>
+        <w:gridCol w:w="2640"/>
+        <w:gridCol w:w="2640"/>
+      </w:tblGrid>
+      <w:tr>
+        <w:trPr>
+          <w:tblHeader w:val="true"/>
+        </w:trPr>
+        <w:tc>
+          <w:tcPr/>
+          <w:p>
+            <w:pPr>
+              <w:pStyle w:val="Compact"/>
+              <w:jc w:val="left"/>
+            </w:pPr>
+            <w:r>
+              <w:t xml:space="preserve">Criterion</w:t>
+            </w:r>
+          </w:p>
+        </w:tc>
+        <w:tc>
+          <w:tcPr/>
+          <w:p>
+            <w:pPr>
+              <w:pStyle w:val="Compact"/>
+              <w:jc w:val="left"/>
+            </w:pPr>
+            <w:r>
+              <w:t xml:space="preserve">Points</w:t>
+            </w:r>
+          </w:p>
+        </w:tc>
+        <w:tc>
+          <w:tcPr/>
+          <w:p>
+            <w:pPr>
+              <w:pStyle w:val="Compact"/>
+              <w:jc w:val="left"/>
+            </w:pPr>
+            <w:r>
+              <w:t xml:space="preserve">What It Measures</w:t>
+            </w:r>
+          </w:p>
+        </w:tc>
+      </w:tr>
+      <w:tr>
+        <w:tc>
+          <w:tcPr/>
+          <w:p>
+            <w:pPr>
+              <w:pStyle w:val="Compact"/>
+              <w:jc w:val="left"/>
+            </w:pPr>
+            <w:r>
+              <w:rPr>
+                <w:bCs/>
+                <w:b/>
+              </w:rPr>
+              <w:t xml:space="preserve">Issue Assigned</w:t>
+            </w:r>
+          </w:p>
+        </w:tc>
+        <w:tc>
+          <w:tcPr/>
+          <w:p>
+            <w:pPr>
+              <w:pStyle w:val="Compact"/>
+              <w:jc w:val="left"/>
+            </w:pPr>
+            <w:r>
+              <w:t xml:space="preserve">10</w:t>
+            </w:r>
+          </w:p>
+        </w:tc>
+        <w:tc>
+          <w:tcPr/>
+          <w:p>
+            <w:pPr>
+              <w:pStyle w:val="Compact"/>
+              <w:jc w:val="left"/>
+            </w:pPr>
+            <w:r>
+              <w:t xml:space="preserve">You assigned at least one issue to yourself (waived for docpacs repos)</w:t>
+            </w:r>
+          </w:p>
+        </w:tc>
+      </w:tr>
+      <w:tr>
+        <w:tc>
+          <w:tcPr/>
+          <w:p>
+            <w:pPr>
+              <w:pStyle w:val="Compact"/>
+              <w:jc w:val="left"/>
+            </w:pPr>
+            <w:r>
+              <w:rPr>
+                <w:bCs/>
+                <w:b/>
+              </w:rPr>
+              <w:t xml:space="preserve">Commits Made</w:t>
+            </w:r>
+          </w:p>
+        </w:tc>
+        <w:tc>
+          <w:tcPr/>
+          <w:p>
+            <w:pPr>
+              <w:pStyle w:val="Compact"/>
+              <w:jc w:val="left"/>
+            </w:pPr>
+            <w:r>
+              <w:t xml:space="preserve">20</w:t>
+            </w:r>
+          </w:p>
+        </w:tc>
+        <w:tc>
+          <w:tcPr/>
+          <w:p>
+            <w:pPr>
+              <w:pStyle w:val="Compact"/>
+              <w:jc w:val="left"/>
+            </w:pPr>
+            <w:r>
+              <w:t xml:space="preserve">You made commits that address the issue</w:t>
+            </w:r>
+          </w:p>
+        </w:tc>
+      </w:tr>
+      <w:tr>
+        <w:tc>
+          <w:tcPr/>
+          <w:p>
+            <w:pPr>
+              <w:pStyle w:val="Compact"/>
+              <w:jc w:val="left"/>
+            </w:pPr>
+            <w:r>
+              <w:rPr>
+                <w:bCs/>
+                <w:b/>
+              </w:rPr>
+              <w:t xml:space="preserve">Pull Request Created</w:t>
+            </w:r>
+          </w:p>
+        </w:tc>
+        <w:tc>
+          <w:tcPr/>
+          <w:p>
+            <w:pPr>
+              <w:pStyle w:val="Compact"/>
+              <w:jc w:val="left"/>
+            </w:pPr>
+            <w:r>
+              <w:t xml:space="preserve">20</w:t>
+            </w:r>
+          </w:p>
+        </w:tc>
+        <w:tc>
+          <w:tcPr/>
+          <w:p>
+            <w:pPr>
+              <w:pStyle w:val="Compact"/>
+              <w:jc w:val="left"/>
+            </w:pPr>
+            <w:r>
+              <w:t xml:space="preserve">You created a pull request for your changes</w:t>
+            </w:r>
+          </w:p>
+        </w:tc>
+      </w:tr>
+      <w:tr>
+        <w:tc>
+          <w:tcPr/>
+          <w:p>
+            <w:pPr>
+              <w:pStyle w:val="Compact"/>
+              <w:jc w:val="left"/>
+            </w:pPr>
+            <w:r>
+              <w:rPr>
+                <w:bCs/>
+                <w:b/>
+              </w:rPr>
+              <w:t xml:space="preserve">Issue Completed</w:t>
+            </w:r>
+          </w:p>
+        </w:tc>
+        <w:tc>
+          <w:tcPr/>
+          <w:p>
+            <w:pPr>
+              <w:pStyle w:val="Compact"/>
+              <w:jc w:val="left"/>
+            </w:pPr>
+            <w:r>
+              <w:t xml:space="preserve">30</w:t>
+            </w:r>
+          </w:p>
+        </w:tc>
+        <w:tc>
+          <w:tcPr/>
+          <w:p>
+            <w:pPr>
+              <w:pStyle w:val="Compact"/>
+              <w:jc w:val="left"/>
+            </w:pPr>
+            <w:r>
+              <w:t xml:space="preserve">AI verification that your work actually solves the issue</w:t>
+            </w:r>
+          </w:p>
+        </w:tc>
+      </w:tr>
+      <w:tr>
+        <w:tc>
+          <w:tcPr/>
+          <w:p>
+            <w:pPr>
+              <w:pStyle w:val="Compact"/>
+              <w:jc w:val="left"/>
+            </w:pPr>
+            <w:r>
+              <w:rPr>
+                <w:bCs/>
+                <w:b/>
+              </w:rPr>
+              <w:t xml:space="preserve">Pull Request Merged</w:t>
+            </w:r>
+          </w:p>
+        </w:tc>
+        <w:tc>
+          <w:tcPr/>
+          <w:p>
+            <w:pPr>
+              <w:pStyle w:val="Compact"/>
+              <w:jc w:val="left"/>
+            </w:pPr>
+            <w:r>
+              <w:t xml:space="preserve">10</w:t>
+            </w:r>
+          </w:p>
+        </w:tc>
+        <w:tc>
+          <w:tcPr/>
+          <w:p>
+            <w:pPr>
+              <w:pStyle w:val="Compact"/>
+              <w:jc w:val="left"/>
+            </w:pPr>
+            <w:r>
+              <w:t xml:space="preserve">Your pull request was accepted and merged</w:t>
+            </w:r>
+          </w:p>
+        </w:tc>
+      </w:tr>
+      <w:tr>
+        <w:tc>
+          <w:tcPr/>
+          <w:p>
+            <w:pPr>
+              <w:pStyle w:val="Compact"/>
+              <w:jc w:val="left"/>
+            </w:pPr>
+            <w:r>
+              <w:rPr>
+                <w:bCs/>
+                <w:b/>
+              </w:rPr>
+              <w:t xml:space="preserve">Project Board Workflow</w:t>
+            </w:r>
+          </w:p>
+        </w:tc>
+        <w:tc>
+          <w:tcPr/>
+          <w:p>
+            <w:pPr>
+              <w:pStyle w:val="Compact"/>
+              <w:jc w:val="left"/>
+            </w:pPr>
+            <w:r>
+              <w:t xml:space="preserve">0</w:t>
+            </w:r>
+          </w:p>
+        </w:tc>
+        <w:tc>
+          <w:tcPr/>
+          <w:p>
+            <w:pPr>
+              <w:pStyle w:val="Compact"/>
+              <w:jc w:val="left"/>
+            </w:pPr>
+            <w:r>
+              <w:t xml:space="preserve">Not checked for individual grading across multiple repos</w:t>
+            </w:r>
+          </w:p>
+        </w:tc>
+      </w:tr>
+    </w:tbl>
+    <w:p>
+      <w:pPr>
+        <w:pStyle w:val="BodyText"/>
+      </w:pPr>
+      <w:r>
+        <w:rPr>
+          <w:bCs/>
+          <w:b/>
+        </w:rPr>
+        <w:t xml:space="preserve">Important Notes:</w:t>
+      </w:r>
+    </w:p>
+    <w:p>
+      <w:pPr>
+        <w:numPr>
+          <w:ilvl w:val="0"/>
+          <w:numId w:val="1002"/>
+        </w:numPr>
+        <w:pStyle w:val="Compact"/>
+      </w:pPr>
+      <w:r>
+        <w:t xml:space="preserve">If you’re working in a repository whose name starts with</w:t>
+      </w:r>
+      <w:r>
+        <w:t xml:space="preserve"> </w:t>
+      </w:r>
+      <w:r>
+        <w:rPr>
+          <w:bCs/>
+          <w:b/>
+        </w:rPr>
+        <w:t xml:space="preserve">“</w:t>
+      </w:r>
+      <w:r>
+        <w:rPr>
+          <w:bCs/>
+          <w:b/>
+        </w:rPr>
+        <w:t xml:space="preserve">docpacs</w:t>
+      </w:r>
+      <w:r>
+        <w:rPr>
+          <w:bCs/>
+          <w:b/>
+        </w:rPr>
+        <w:t xml:space="preserve">”</w:t>
+      </w:r>
+      <w:r>
+        <w:t xml:space="preserve"> </w:t>
+      </w:r>
+      <w:r>
+        <w:t xml:space="preserve">(e.g.,</w:t>
+      </w:r>
+      <w:r>
+        <w:t xml:space="preserve"> </w:t>
+      </w:r>
+      <w:r>
+        <w:rPr>
+          <w:rStyle w:val="VerbatimChar"/>
+        </w:rPr>
+        <w:t xml:space="preserve">docpacs2526</w:t>
+      </w:r>
+      <w:r>
+        <w:t xml:space="preserve">,</w:t>
+      </w:r>
+      <w:r>
+        <w:t xml:space="preserve"> </w:t>
+      </w:r>
+      <w:r>
+        <w:rPr>
+          <w:rStyle w:val="VerbatimChar"/>
+        </w:rPr>
+        <w:t xml:space="preserve">docpacs2425</w:t>
+      </w:r>
+      <w:r>
+        <w:t xml:space="preserve">), the</w:t>
+      </w:r>
+      <w:r>
+        <w:t xml:space="preserve"> </w:t>
+      </w:r>
+      <w:r>
+        <w:rPr>
+          <w:bCs/>
+          <w:b/>
+        </w:rPr>
+        <w:t xml:space="preserve">Issue Assigned</w:t>
+      </w:r>
+      <w:r>
+        <w:t xml:space="preserve"> </w:t>
+      </w:r>
+      <w:r>
+        <w:t xml:space="preserve">criterion is automatically waived - you’ll get full points even if you didn’t assign the issue to yourself.</w:t>
+      </w:r>
+    </w:p>
+    <w:p>
+      <w:pPr>
+        <w:numPr>
+          <w:ilvl w:val="0"/>
+          <w:numId w:val="1002"/>
+        </w:numPr>
+        <w:pStyle w:val="Compact"/>
+      </w:pPr>
+      <w:r>
+        <w:t xml:space="preserve">When graded individually across multiple repos, the</w:t>
+      </w:r>
+      <w:r>
+        <w:t xml:space="preserve"> </w:t>
+      </w:r>
+      <w:r>
+        <w:rPr>
+          <w:bCs/>
+          <w:b/>
+        </w:rPr>
+        <w:t xml:space="preserve">Project Board Workflow</w:t>
+      </w:r>
+      <w:r>
+        <w:t xml:space="preserve"> </w:t>
+      </w:r>
+      <w:r>
+        <w:t xml:space="preserve">criterion is skipped (you can’t get those 10 points, but you also can’t lose them).</w:t>
+      </w:r>
+    </w:p>
+    <w:bookmarkEnd w:id="22"/>
+    <w:bookmarkEnd w:id="23"/>
+    <w:bookmarkStart w:id="31" w:name="step-by-step-guide-to-maximum-points"/>
     <w:p>
       <w:pPr>
         <w:pStyle w:val="Heading2"/>
@@ -392,7 +901,7 @@
         <w:t xml:space="preserve">to ensure you get full credit:</w:t>
       </w:r>
     </w:p>
-    <w:bookmarkStart w:id="21" w:name="Xbe76585b8a29eca0e07959b59a17344af085d49"/>
+    <w:bookmarkStart w:id="24" w:name="Xbe76585b8a29eca0e07959b59a17344af085d49"/>
     <w:p>
       <w:pPr>
         <w:pStyle w:val="Heading3"/>
@@ -417,7 +926,7 @@
       <w:pPr>
         <w:numPr>
           <w:ilvl w:val="0"/>
-          <w:numId w:val="1001"/>
+          <w:numId w:val="1003"/>
         </w:numPr>
         <w:pStyle w:val="Compact"/>
       </w:pPr>
@@ -445,7 +954,7 @@
       <w:pPr>
         <w:numPr>
           <w:ilvl w:val="0"/>
-          <w:numId w:val="1001"/>
+          <w:numId w:val="1003"/>
         </w:numPr>
         <w:pStyle w:val="Compact"/>
       </w:pPr>
@@ -457,7 +966,7 @@
       <w:pPr>
         <w:numPr>
           <w:ilvl w:val="0"/>
-          <w:numId w:val="1001"/>
+          <w:numId w:val="1003"/>
         </w:numPr>
         <w:pStyle w:val="Compact"/>
       </w:pPr>
@@ -497,7 +1006,7 @@
       <w:pPr>
         <w:numPr>
           <w:ilvl w:val="0"/>
-          <w:numId w:val="1001"/>
+          <w:numId w:val="1003"/>
         </w:numPr>
         <w:pStyle w:val="Compact"/>
       </w:pPr>
@@ -530,6 +1039,109 @@
           <w:bCs/>
           <w:b/>
         </w:rPr>
+        <w:t xml:space="preserve">Special Exception for docpacs Repositories:</w:t>
+      </w:r>
+    </w:p>
+    <w:p>
+      <w:pPr>
+        <w:numPr>
+          <w:ilvl w:val="0"/>
+          <w:numId w:val="1004"/>
+        </w:numPr>
+        <w:pStyle w:val="Compact"/>
+      </w:pPr>
+      <w:r>
+        <w:t xml:space="preserve">If you’re working in a repository whose name starts with</w:t>
+      </w:r>
+      <w:r>
+        <w:t xml:space="preserve"> </w:t>
+      </w:r>
+      <w:r>
+        <w:rPr>
+          <w:bCs/>
+          <w:b/>
+        </w:rPr>
+        <w:t xml:space="preserve">“</w:t>
+      </w:r>
+      <w:r>
+        <w:rPr>
+          <w:bCs/>
+          <w:b/>
+        </w:rPr>
+        <w:t xml:space="preserve">docpacs</w:t>
+      </w:r>
+      <w:r>
+        <w:rPr>
+          <w:bCs/>
+          <w:b/>
+        </w:rPr>
+        <w:t xml:space="preserve">”</w:t>
+      </w:r>
+      <w:r>
+        <w:t xml:space="preserve"> </w:t>
+      </w:r>
+      <w:r>
+        <w:t xml:space="preserve">(e.g.,</w:t>
+      </w:r>
+      <w:r>
+        <w:t xml:space="preserve"> </w:t>
+      </w:r>
+      <w:r>
+        <w:rPr>
+          <w:rStyle w:val="VerbatimChar"/>
+        </w:rPr>
+        <w:t xml:space="preserve">docpacs2526</w:t>
+      </w:r>
+      <w:r>
+        <w:t xml:space="preserve">,</w:t>
+      </w:r>
+      <w:r>
+        <w:t xml:space="preserve"> </w:t>
+      </w:r>
+      <w:r>
+        <w:rPr>
+          <w:rStyle w:val="VerbatimChar"/>
+        </w:rPr>
+        <w:t xml:space="preserve">docpacs2425</w:t>
+      </w:r>
+      <w:r>
+        <w:t xml:space="preserve">), you</w:t>
+      </w:r>
+      <w:r>
+        <w:t xml:space="preserve"> </w:t>
+      </w:r>
+      <w:r>
+        <w:rPr>
+          <w:bCs/>
+          <w:b/>
+        </w:rPr>
+        <w:t xml:space="preserve">do NOT need to assign the issue to yourself</w:t>
+      </w:r>
+      <w:r>
+        <w:t xml:space="preserve">. The grading bot will automatically give you full points for this criterion.</w:t>
+      </w:r>
+    </w:p>
+    <w:p>
+      <w:pPr>
+        <w:numPr>
+          <w:ilvl w:val="0"/>
+          <w:numId w:val="1004"/>
+        </w:numPr>
+        <w:pStyle w:val="Compact"/>
+      </w:pPr>
+      <w:r>
+        <w:t xml:space="preserve">However, it’s still a good practice to assign issues to yourself for clarity!</w:t>
+      </w:r>
+    </w:p>
+    <w:p>
+      <w:pPr>
+        <w:pStyle w:val="FirstParagraph"/>
+      </w:pPr>
+      <w:r>
+        <w:rPr>
+          <w:bCs/>
+          <w:b/>
+        </w:rPr>
         <w:t xml:space="preserve">Best Practices:</w:t>
       </w:r>
     </w:p>
@@ -537,7 +1149,7 @@
       <w:pPr>
         <w:numPr>
           <w:ilvl w:val="0"/>
-          <w:numId w:val="1002"/>
+          <w:numId w:val="1005"/>
         </w:numPr>
         <w:pStyle w:val="Compact"/>
       </w:pPr>
@@ -582,7 +1194,7 @@
       <w:pPr>
         <w:numPr>
           <w:ilvl w:val="0"/>
-          <w:numId w:val="1002"/>
+          <w:numId w:val="1005"/>
         </w:numPr>
         <w:pStyle w:val="Compact"/>
       </w:pPr>
@@ -594,19 +1206,19 @@
       <w:pPr>
         <w:numPr>
           <w:ilvl w:val="0"/>
-          <w:numId w:val="1002"/>
-        </w:numPr>
-        <w:pStyle w:val="Compact"/>
-      </w:pPr>
-      <w:r>
-        <w:t xml:space="preserve">✅ Make sure the issue is assigned to YOU (your GitHub username)</w:t>
-      </w:r>
-    </w:p>
-    <w:p>
-      <w:pPr>
-        <w:numPr>
-          <w:ilvl w:val="0"/>
-          <w:numId w:val="1002"/>
+          <w:numId w:val="1005"/>
+        </w:numPr>
+        <w:pStyle w:val="Compact"/>
+      </w:pPr>
+      <w:r>
+        <w:t xml:space="preserve">✅ Make sure the issue is assigned to YOU (your GitHub username) - unless working in a docpacs repo</w:t>
+      </w:r>
+    </w:p>
+    <w:p>
+      <w:pPr>
+        <w:numPr>
+          <w:ilvl w:val="0"/>
+          <w:numId w:val="1005"/>
         </w:numPr>
         <w:pStyle w:val="Compact"/>
       </w:pPr>
@@ -630,7 +1242,7 @@
       <w:pPr>
         <w:numPr>
           <w:ilvl w:val="0"/>
-          <w:numId w:val="1003"/>
+          <w:numId w:val="1006"/>
         </w:numPr>
         <w:pStyle w:val="Compact"/>
       </w:pPr>
@@ -642,19 +1254,19 @@
       <w:pPr>
         <w:numPr>
           <w:ilvl w:val="0"/>
-          <w:numId w:val="1003"/>
-        </w:numPr>
-        <w:pStyle w:val="Compact"/>
-      </w:pPr>
-      <w:r>
-        <w:t xml:space="preserve">❌ Forgetting to assign the issue to yourself</w:t>
-      </w:r>
-    </w:p>
-    <w:p>
-      <w:pPr>
-        <w:numPr>
-          <w:ilvl w:val="0"/>
-          <w:numId w:val="1003"/>
+          <w:numId w:val="1006"/>
+        </w:numPr>
+        <w:pStyle w:val="Compact"/>
+      </w:pPr>
+      <w:r>
+        <w:t xml:space="preserve">❌ Forgetting to assign the issue to yourself (not required for docpacs repos, but still recommended)</w:t>
+      </w:r>
+    </w:p>
+    <w:p>
+      <w:pPr>
+        <w:numPr>
+          <w:ilvl w:val="0"/>
+          <w:numId w:val="1006"/>
         </w:numPr>
         <w:pStyle w:val="Compact"/>
       </w:pPr>
@@ -674,8 +1286,8 @@
         <w:t xml:space="preserve">”</w:t>
       </w:r>
     </w:p>
-    <w:bookmarkEnd w:id="21"/>
-    <w:bookmarkStart w:id="22" w:name="Xc124497c5c16c7b764895b7f3bbfe791b02a676"/>
+    <w:bookmarkEnd w:id="24"/>
+    <w:bookmarkStart w:id="25" w:name="Xc124497c5c16c7b764895b7f3bbfe791b02a676"/>
     <w:p>
       <w:pPr>
         <w:pStyle w:val="Heading3"/>
@@ -718,7 +1330,7 @@
       <w:pPr>
         <w:numPr>
           <w:ilvl w:val="0"/>
-          <w:numId w:val="1004"/>
+          <w:numId w:val="1007"/>
         </w:numPr>
         <w:pStyle w:val="Compact"/>
       </w:pPr>
@@ -746,7 +1358,7 @@
       <w:pPr>
         <w:numPr>
           <w:ilvl w:val="0"/>
-          <w:numId w:val="1004"/>
+          <w:numId w:val="1007"/>
         </w:numPr>
         <w:pStyle w:val="Compact"/>
       </w:pPr>
@@ -758,7 +1370,7 @@
       <w:pPr>
         <w:numPr>
           <w:ilvl w:val="0"/>
-          <w:numId w:val="1004"/>
+          <w:numId w:val="1007"/>
         </w:numPr>
         <w:pStyle w:val="Compact"/>
       </w:pPr>
@@ -836,7 +1448,7 @@
       <w:pPr>
         <w:numPr>
           <w:ilvl w:val="0"/>
-          <w:numId w:val="1005"/>
+          <w:numId w:val="1008"/>
         </w:numPr>
         <w:pStyle w:val="Compact"/>
       </w:pPr>
@@ -848,7 +1460,7 @@
       <w:pPr>
         <w:numPr>
           <w:ilvl w:val="0"/>
-          <w:numId w:val="1005"/>
+          <w:numId w:val="1008"/>
         </w:numPr>
         <w:pStyle w:val="Compact"/>
       </w:pPr>
@@ -866,8 +1478,55 @@
         <w:t xml:space="preserve">To Do → In Progress → Done</w:t>
       </w:r>
     </w:p>
-    <w:bookmarkEnd w:id="22"/>
-    <w:bookmarkStart w:id="23" w:name="X2f0dba1c17a9eeb1152c6041cac662a19472748"/>
+    <w:p>
+      <w:pPr>
+        <w:pStyle w:val="FirstParagraph"/>
+      </w:pPr>
+      <w:r>
+        <w:rPr>
+          <w:bCs/>
+          <w:b/>
+        </w:rPr>
+        <w:t xml:space="preserve">Important:</w:t>
+      </w:r>
+      <w:r>
+        <w:t xml:space="preserve"> </w:t>
+      </w:r>
+      <w:r>
+        <w:t xml:space="preserve">This step is</w:t>
+      </w:r>
+      <w:r>
+        <w:t xml:space="preserve"> </w:t>
+      </w:r>
+      <w:r>
+        <w:rPr>
+          <w:bCs/>
+          <w:b/>
+        </w:rPr>
+        <w:t xml:space="preserve">only required for Team Grading</w:t>
+      </w:r>
+      <w:r>
+        <w:t xml:space="preserve"> </w:t>
+      </w:r>
+      <w:r>
+        <w:t xml:space="preserve">(single repository). If you’re being graded individually across multiple repositories, the Project Board Workflow criterion is</w:t>
+      </w:r>
+      <w:r>
+        <w:t xml:space="preserve"> </w:t>
+      </w:r>
+      <w:r>
+        <w:rPr>
+          <w:bCs/>
+          <w:b/>
+        </w:rPr>
+        <w:t xml:space="preserve">not checked</w:t>
+      </w:r>
+      <w:r>
+        <w:t xml:space="preserve">, so you can skip this step and Step 7. However, it’s still good practice to use project boards!</w:t>
+      </w:r>
+    </w:p>
+    <w:bookmarkEnd w:id="25"/>
+    <w:bookmarkStart w:id="26" w:name="X2f0dba1c17a9eeb1152c6041cac662a19472748"/>
     <w:p>
       <w:pPr>
         <w:pStyle w:val="Heading3"/>
@@ -892,7 +1551,7 @@
       <w:pPr>
         <w:numPr>
           <w:ilvl w:val="0"/>
-          <w:numId w:val="1006"/>
+          <w:numId w:val="1009"/>
         </w:numPr>
         <w:pStyle w:val="Compact"/>
       </w:pPr>
@@ -955,7 +1614,7 @@
       <w:pPr>
         <w:numPr>
           <w:ilvl w:val="0"/>
-          <w:numId w:val="1006"/>
+          <w:numId w:val="1009"/>
         </w:numPr>
         <w:pStyle w:val="Compact"/>
       </w:pPr>
@@ -967,7 +1626,7 @@
       <w:pPr>
         <w:numPr>
           <w:ilvl w:val="0"/>
-          <w:numId w:val="1006"/>
+          <w:numId w:val="1009"/>
         </w:numPr>
         <w:pStyle w:val="Compact"/>
       </w:pPr>
@@ -1046,7 +1705,7 @@
       <w:pPr>
         <w:numPr>
           <w:ilvl w:val="0"/>
-          <w:numId w:val="1006"/>
+          <w:numId w:val="1009"/>
         </w:numPr>
         <w:pStyle w:val="Compact"/>
       </w:pPr>
@@ -1109,7 +1768,7 @@
       <w:pPr>
         <w:numPr>
           <w:ilvl w:val="0"/>
-          <w:numId w:val="1007"/>
+          <w:numId w:val="1010"/>
         </w:numPr>
         <w:pStyle w:val="Compact"/>
       </w:pPr>
@@ -1154,7 +1813,7 @@
       <w:pPr>
         <w:numPr>
           <w:ilvl w:val="0"/>
-          <w:numId w:val="1007"/>
+          <w:numId w:val="1010"/>
         </w:numPr>
         <w:pStyle w:val="Compact"/>
       </w:pPr>
@@ -1166,7 +1825,7 @@
       <w:pPr>
         <w:numPr>
           <w:ilvl w:val="0"/>
-          <w:numId w:val="1007"/>
+          <w:numId w:val="1010"/>
         </w:numPr>
         <w:pStyle w:val="Compact"/>
       </w:pPr>
@@ -1178,7 +1837,7 @@
       <w:pPr>
         <w:numPr>
           <w:ilvl w:val="0"/>
-          <w:numId w:val="1007"/>
+          <w:numId w:val="1010"/>
         </w:numPr>
         <w:pStyle w:val="Compact"/>
       </w:pPr>
@@ -1202,7 +1861,7 @@
       <w:pPr>
         <w:numPr>
           <w:ilvl w:val="0"/>
-          <w:numId w:val="1008"/>
+          <w:numId w:val="1011"/>
         </w:numPr>
         <w:pStyle w:val="Compact"/>
       </w:pPr>
@@ -1214,7 +1873,7 @@
       <w:pPr>
         <w:numPr>
           <w:ilvl w:val="0"/>
-          <w:numId w:val="1008"/>
+          <w:numId w:val="1011"/>
         </w:numPr>
         <w:pStyle w:val="Compact"/>
       </w:pPr>
@@ -1226,7 +1885,7 @@
       <w:pPr>
         <w:numPr>
           <w:ilvl w:val="0"/>
-          <w:numId w:val="1008"/>
+          <w:numId w:val="1011"/>
         </w:numPr>
         <w:pStyle w:val="Compact"/>
       </w:pPr>
@@ -1268,7 +1927,7 @@
       <w:pPr>
         <w:numPr>
           <w:ilvl w:val="0"/>
-          <w:numId w:val="1008"/>
+          <w:numId w:val="1011"/>
         </w:numPr>
         <w:pStyle w:val="Compact"/>
       </w:pPr>
@@ -1298,7 +1957,7 @@
       <w:pPr>
         <w:numPr>
           <w:ilvl w:val="0"/>
-          <w:numId w:val="1009"/>
+          <w:numId w:val="1012"/>
         </w:numPr>
         <w:pStyle w:val="Compact"/>
       </w:pPr>
@@ -1310,7 +1969,7 @@
       <w:pPr>
         <w:numPr>
           <w:ilvl w:val="0"/>
-          <w:numId w:val="1009"/>
+          <w:numId w:val="1012"/>
         </w:numPr>
         <w:pStyle w:val="Compact"/>
       </w:pPr>
@@ -1322,7 +1981,7 @@
       <w:pPr>
         <w:numPr>
           <w:ilvl w:val="0"/>
-          <w:numId w:val="1009"/>
+          <w:numId w:val="1012"/>
         </w:numPr>
         <w:pStyle w:val="Compact"/>
       </w:pPr>
@@ -1330,8 +1989,8 @@
         <w:t xml:space="preserve">Reference the issue number in your PR description</w:t>
       </w:r>
     </w:p>
-    <w:bookmarkEnd w:id="23"/>
-    <w:bookmarkStart w:id="24" w:name="step-4-create-a-pull-request-20-points"/>
+    <w:bookmarkEnd w:id="26"/>
+    <w:bookmarkStart w:id="27" w:name="step-4-create-a-pull-request-20-points"/>
     <w:p>
       <w:pPr>
         <w:pStyle w:val="Heading3"/>
@@ -1356,7 +2015,7 @@
       <w:pPr>
         <w:numPr>
           <w:ilvl w:val="0"/>
-          <w:numId w:val="1010"/>
+          <w:numId w:val="1013"/>
         </w:numPr>
         <w:pStyle w:val="Compact"/>
       </w:pPr>
@@ -1384,7 +2043,7 @@
       <w:pPr>
         <w:numPr>
           <w:ilvl w:val="0"/>
-          <w:numId w:val="1010"/>
+          <w:numId w:val="1013"/>
         </w:numPr>
         <w:pStyle w:val="Compact"/>
       </w:pPr>
@@ -1420,7 +2079,7 @@
       <w:pPr>
         <w:numPr>
           <w:ilvl w:val="0"/>
-          <w:numId w:val="1010"/>
+          <w:numId w:val="1013"/>
         </w:numPr>
         <w:pStyle w:val="Compact"/>
       </w:pPr>
@@ -1432,7 +2091,7 @@
       <w:pPr>
         <w:numPr>
           <w:ilvl w:val="0"/>
-          <w:numId w:val="1010"/>
+          <w:numId w:val="1013"/>
         </w:numPr>
         <w:pStyle w:val="Compact"/>
       </w:pPr>
@@ -1528,7 +2187,7 @@
       <w:pPr>
         <w:numPr>
           <w:ilvl w:val="0"/>
-          <w:numId w:val="1010"/>
+          <w:numId w:val="1013"/>
         </w:numPr>
         <w:pStyle w:val="Compact"/>
       </w:pPr>
@@ -1576,7 +2235,7 @@
       <w:pPr>
         <w:numPr>
           <w:ilvl w:val="0"/>
-          <w:numId w:val="1011"/>
+          <w:numId w:val="1014"/>
         </w:numPr>
         <w:pStyle w:val="Compact"/>
       </w:pPr>
@@ -1624,7 +2283,7 @@
       <w:pPr>
         <w:numPr>
           <w:ilvl w:val="0"/>
-          <w:numId w:val="1011"/>
+          <w:numId w:val="1014"/>
         </w:numPr>
         <w:pStyle w:val="Compact"/>
       </w:pPr>
@@ -1636,7 +2295,7 @@
       <w:pPr>
         <w:numPr>
           <w:ilvl w:val="0"/>
-          <w:numId w:val="1011"/>
+          <w:numId w:val="1014"/>
         </w:numPr>
         <w:pStyle w:val="Compact"/>
       </w:pPr>
@@ -1648,7 +2307,7 @@
       <w:pPr>
         <w:numPr>
           <w:ilvl w:val="0"/>
-          <w:numId w:val="1011"/>
+          <w:numId w:val="1014"/>
         </w:numPr>
         <w:pStyle w:val="Compact"/>
       </w:pPr>
@@ -1660,7 +2319,7 @@
       <w:pPr>
         <w:numPr>
           <w:ilvl w:val="0"/>
-          <w:numId w:val="1011"/>
+          <w:numId w:val="1014"/>
         </w:numPr>
         <w:pStyle w:val="Compact"/>
       </w:pPr>
@@ -1699,7 +2358,7 @@
       <w:pPr>
         <w:numPr>
           <w:ilvl w:val="0"/>
-          <w:numId w:val="1012"/>
+          <w:numId w:val="1015"/>
         </w:numPr>
         <w:pStyle w:val="Compact"/>
       </w:pPr>
@@ -1711,7 +2370,7 @@
       <w:pPr>
         <w:numPr>
           <w:ilvl w:val="0"/>
-          <w:numId w:val="1012"/>
+          <w:numId w:val="1015"/>
         </w:numPr>
         <w:pStyle w:val="Compact"/>
       </w:pPr>
@@ -1723,7 +2382,7 @@
       <w:pPr>
         <w:numPr>
           <w:ilvl w:val="0"/>
-          <w:numId w:val="1012"/>
+          <w:numId w:val="1015"/>
         </w:numPr>
         <w:pStyle w:val="Compact"/>
       </w:pPr>
@@ -1731,8 +2390,8 @@
         <w:t xml:space="preserve">❌ Creating a PR but not linking it to your issue</w:t>
       </w:r>
     </w:p>
-    <w:bookmarkEnd w:id="24"/>
-    <w:bookmarkStart w:id="25" w:name="X03ad591a7a161b146ae2527cb7770facd1ae942"/>
+    <w:bookmarkEnd w:id="27"/>
+    <w:bookmarkStart w:id="28" w:name="X03ad591a7a161b146ae2527cb7770facd1ae942"/>
     <w:p>
       <w:pPr>
         <w:pStyle w:val="Heading3"/>
@@ -1772,7 +2431,23 @@
         <w:t xml:space="preserve"> </w:t>
       </w:r>
       <w:r>
-        <w:t xml:space="preserve">that compares your issue description with the changes in your pull request.</w:t>
+        <w:t xml:space="preserve">that examines your</w:t>
+      </w:r>
+      <w:r>
+        <w:t xml:space="preserve"> </w:t>
+      </w:r>
+      <w:r>
+        <w:rPr>
+          <w:bCs/>
+          <w:b/>
+        </w:rPr>
+        <w:t xml:space="preserve">ACTUAL CODE CHANGES</w:t>
+      </w:r>
+      <w:r>
+        <w:t xml:space="preserve"> </w:t>
+      </w:r>
+      <w:r>
+        <w:t xml:space="preserve">(the diff in your pull request) to verify they address the issue.</w:t>
       </w:r>
     </w:p>
     <w:p>
@@ -1784,6 +2459,26 @@
           <w:bCs/>
           <w:b/>
         </w:rPr>
+        <w:t xml:space="preserve">⚠️ CRITICAL: The AI looks at your CODE, not just your descriptions!</w:t>
+      </w:r>
+    </w:p>
+    <w:p>
+      <w:pPr>
+        <w:pStyle w:val="BodyText"/>
+      </w:pPr>
+      <w:r>
+        <w:t xml:space="preserve">The AI doesn’t just compare the issue description with the PR description. It actually reads the code diff (what files you changed, what lines you added/removed) and determines if those specific code modifications solve the problem stated in the issue.</w:t>
+      </w:r>
+    </w:p>
+    <w:p>
+      <w:pPr>
+        <w:pStyle w:val="BodyText"/>
+      </w:pPr>
+      <w:r>
+        <w:rPr>
+          <w:bCs/>
+          <w:b/>
+        </w:rPr>
         <w:t xml:space="preserve">To get full credit:</w:t>
       </w:r>
     </w:p>
@@ -1791,7 +2486,7 @@
       <w:pPr>
         <w:numPr>
           <w:ilvl w:val="0"/>
-          <w:numId w:val="1013"/>
+          <w:numId w:val="1016"/>
         </w:numPr>
         <w:pStyle w:val="Compact"/>
       </w:pPr>
@@ -1807,7 +2502,7 @@
       <w:pPr>
         <w:numPr>
           <w:ilvl w:val="0"/>
-          <w:numId w:val="1013"/>
+          <w:numId w:val="1016"/>
         </w:numPr>
         <w:pStyle w:val="Compact"/>
       </w:pPr>
@@ -1827,19 +2522,31 @@
         <w:t xml:space="preserve">”</w:t>
       </w:r>
       <w:r>
-        <w:t xml:space="preserve">, make sure you actually fix the login button</w:t>
-      </w:r>
-    </w:p>
-    <w:p>
-      <w:pPr>
-        <w:numPr>
-          <w:ilvl w:val="0"/>
-          <w:numId w:val="1013"/>
-        </w:numPr>
-        <w:pStyle w:val="Compact"/>
-      </w:pPr>
-      <w:r>
-        <w:t xml:space="preserve">Don’t make unrelated changes (e.g., fixing the login button when the issue was about the signup form)</w:t>
+        <w:t xml:space="preserve">, you must modify code related to the login button</w:t>
+      </w:r>
+    </w:p>
+    <w:p>
+      <w:pPr>
+        <w:numPr>
+          <w:ilvl w:val="0"/>
+          <w:numId w:val="1016"/>
+        </w:numPr>
+        <w:pStyle w:val="Compact"/>
+      </w:pPr>
+      <w:r>
+        <w:t xml:space="preserve">Don’t make unrelated changes (e.g., fixing styling when the issue asks for functionality)</w:t>
+      </w:r>
+    </w:p>
+    <w:p>
+      <w:pPr>
+        <w:numPr>
+          <w:ilvl w:val="0"/>
+          <w:numId w:val="1016"/>
+        </w:numPr>
+        <w:pStyle w:val="Compact"/>
+      </w:pPr>
+      <w:r>
+        <w:t xml:space="preserve">The AI will look at which files you modified and what code you changed</w:t>
       </w:r>
     </w:p>
     <w:p>
@@ -1858,7 +2565,7 @@
       <w:pPr>
         <w:numPr>
           <w:ilvl w:val="0"/>
-          <w:numId w:val="1014"/>
+          <w:numId w:val="1017"/>
         </w:numPr>
         <w:pStyle w:val="Compact"/>
       </w:pPr>
@@ -1870,19 +2577,31 @@
       <w:pPr>
         <w:numPr>
           <w:ilvl w:val="0"/>
-          <w:numId w:val="1014"/>
-        </w:numPr>
-        <w:pStyle w:val="Compact"/>
-      </w:pPr>
-      <w:r>
-        <w:t xml:space="preserve">✅ Make changes that clearly solve the stated problem</w:t>
-      </w:r>
-    </w:p>
-    <w:p>
-      <w:pPr>
-        <w:numPr>
-          <w:ilvl w:val="0"/>
-          <w:numId w:val="1014"/>
+          <w:numId w:val="1017"/>
+        </w:numPr>
+        <w:pStyle w:val="Compact"/>
+      </w:pPr>
+      <w:r>
+        <w:t xml:space="preserve">✅ Make code changes that clearly solve the stated problem</w:t>
+      </w:r>
+    </w:p>
+    <w:p>
+      <w:pPr>
+        <w:numPr>
+          <w:ilvl w:val="0"/>
+          <w:numId w:val="1017"/>
+        </w:numPr>
+        <w:pStyle w:val="Compact"/>
+      </w:pPr>
+      <w:r>
+        <w:t xml:space="preserve">✅ Modify the right files (if issue mentions login, modify login-related files)</w:t>
+      </w:r>
+    </w:p>
+    <w:p>
+      <w:pPr>
+        <w:numPr>
+          <w:ilvl w:val="0"/>
+          <w:numId w:val="1017"/>
         </w:numPr>
         <w:pStyle w:val="Compact"/>
       </w:pPr>
@@ -1894,7 +2613,7 @@
       <w:pPr>
         <w:numPr>
           <w:ilvl w:val="0"/>
-          <w:numId w:val="1014"/>
+          <w:numId w:val="1017"/>
         </w:numPr>
         <w:pStyle w:val="Compact"/>
       </w:pPr>
@@ -1904,6 +2623,30 @@
     </w:p>
     <w:p>
       <w:pPr>
+        <w:numPr>
+          <w:ilvl w:val="0"/>
+          <w:numId w:val="1017"/>
+        </w:numPr>
+        <w:pStyle w:val="Compact"/>
+      </w:pPr>
+      <w:r>
+        <w:t xml:space="preserve">✅ Make sure your code changes are substantial enough to solve the issue</w:t>
+      </w:r>
+    </w:p>
+    <w:p>
+      <w:pPr>
+        <w:numPr>
+          <w:ilvl w:val="0"/>
+          <w:numId w:val="1017"/>
+        </w:numPr>
+        <w:pStyle w:val="Compact"/>
+      </w:pPr>
+      <w:r>
+        <w:t xml:space="preserve">✅ Don’t just write a description - actually change the code!</w:t>
+      </w:r>
+    </w:p>
+    <w:p>
+      <w:pPr>
         <w:pStyle w:val="FirstParagraph"/>
       </w:pPr>
       <w:r>
@@ -1918,7 +2661,7 @@
       <w:pPr>
         <w:numPr>
           <w:ilvl w:val="0"/>
-          <w:numId w:val="1015"/>
+          <w:numId w:val="1018"/>
         </w:numPr>
         <w:pStyle w:val="Compact"/>
       </w:pPr>
@@ -1930,7 +2673,7 @@
       <w:pPr>
         <w:numPr>
           <w:ilvl w:val="0"/>
-          <w:numId w:val="1015"/>
+          <w:numId w:val="1018"/>
         </w:numPr>
         <w:pStyle w:val="Compact"/>
       </w:pPr>
@@ -1942,7 +2685,7 @@
       <w:pPr>
         <w:numPr>
           <w:ilvl w:val="0"/>
-          <w:numId w:val="1015"/>
+          <w:numId w:val="1018"/>
         </w:numPr>
         <w:pStyle w:val="Compact"/>
       </w:pPr>
@@ -1954,7 +2697,7 @@
       <w:pPr>
         <w:numPr>
           <w:ilvl w:val="0"/>
-          <w:numId w:val="1015"/>
+          <w:numId w:val="1018"/>
         </w:numPr>
         <w:pStyle w:val="Compact"/>
       </w:pPr>
@@ -1964,6 +2707,60 @@
     </w:p>
     <w:p>
       <w:pPr>
+        <w:numPr>
+          <w:ilvl w:val="0"/>
+          <w:numId w:val="1018"/>
+        </w:numPr>
+        <w:pStyle w:val="Compact"/>
+      </w:pPr>
+      <w:r>
+        <w:t xml:space="preserve">❌ Writing great descriptions but making minimal/wrong code changes</w:t>
+      </w:r>
+    </w:p>
+    <w:p>
+      <w:pPr>
+        <w:numPr>
+          <w:ilvl w:val="0"/>
+          <w:numId w:val="1018"/>
+        </w:numPr>
+        <w:pStyle w:val="Compact"/>
+      </w:pPr>
+      <w:r>
+        <w:t xml:space="preserve">❌ Changing unrelated files (e.g., modifying README when issue is about a bug)</w:t>
+      </w:r>
+    </w:p>
+    <w:p>
+      <w:pPr>
+        <w:numPr>
+          <w:ilvl w:val="0"/>
+          <w:numId w:val="1018"/>
+        </w:numPr>
+        <w:pStyle w:val="Compact"/>
+      </w:pPr>
+      <w:r>
+        <w:t xml:space="preserve">❌ Thinking you can</w:t>
+      </w:r>
+      <w:r>
+        <w:t xml:space="preserve"> </w:t>
+      </w:r>
+      <w:r>
+        <w:t xml:space="preserve">“</w:t>
+      </w:r>
+      <w:r>
+        <w:t xml:space="preserve">trick</w:t>
+      </w:r>
+      <w:r>
+        <w:t xml:space="preserve">”</w:t>
+      </w:r>
+      <w:r>
+        <w:t xml:space="preserve"> </w:t>
+      </w:r>
+      <w:r>
+        <w:t xml:space="preserve">the AI with clever descriptions (it reads the actual code!)</w:t>
+      </w:r>
+    </w:p>
+    <w:p>
+      <w:pPr>
         <w:pStyle w:val="FirstParagraph"/>
       </w:pPr>
       <w:r>
@@ -1978,7 +2775,7 @@
       <w:pPr>
         <w:numPr>
           <w:ilvl w:val="0"/>
-          <w:numId w:val="1016"/>
+          <w:numId w:val="1019"/>
         </w:numPr>
         <w:pStyle w:val="Compact"/>
       </w:pPr>
@@ -2006,29 +2803,77 @@
       <w:pPr>
         <w:numPr>
           <w:ilvl w:val="0"/>
-          <w:numId w:val="1016"/>
-        </w:numPr>
-        <w:pStyle w:val="Compact"/>
-      </w:pPr>
-      <w:r>
-        <w:rPr>
-          <w:bCs/>
-          <w:b/>
-        </w:rPr>
-        <w:t xml:space="preserve">Changes:</w:t>
-      </w:r>
-      <w:r>
-        <w:t xml:space="preserve"> </w:t>
-      </w:r>
-      <w:r>
-        <w:t xml:space="preserve">Updated CSS to center the login button, added media queries for mobile responsiveness</w:t>
-      </w:r>
-    </w:p>
-    <w:p>
-      <w:pPr>
-        <w:numPr>
-          <w:ilvl w:val="0"/>
-          <w:numId w:val="1016"/>
+          <w:numId w:val="1019"/>
+        </w:numPr>
+        <w:pStyle w:val="Compact"/>
+      </w:pPr>
+      <w:r>
+        <w:rPr>
+          <w:bCs/>
+          <w:b/>
+        </w:rPr>
+        <w:t xml:space="preserve">Code Changes (what the AI sees):</w:t>
+      </w:r>
+    </w:p>
+    <w:p>
+      <w:pPr>
+        <w:numPr>
+          <w:ilvl w:val="1"/>
+          <w:numId w:val="1020"/>
+        </w:numPr>
+        <w:pStyle w:val="Compact"/>
+      </w:pPr>
+      <w:r>
+        <w:t xml:space="preserve">Modified</w:t>
+      </w:r>
+      <w:r>
+        <w:t xml:space="preserve"> </w:t>
+      </w:r>
+      <w:r>
+        <w:rPr>
+          <w:rStyle w:val="VerbatimChar"/>
+        </w:rPr>
+        <w:t xml:space="preserve">styles/login.css</w:t>
+      </w:r>
+    </w:p>
+    <w:p>
+      <w:pPr>
+        <w:numPr>
+          <w:ilvl w:val="1"/>
+          <w:numId w:val="1020"/>
+        </w:numPr>
+        <w:pStyle w:val="Compact"/>
+      </w:pPr>
+      <w:r>
+        <w:t xml:space="preserve">Added CSS rules:</w:t>
+      </w:r>
+      <w:r>
+        <w:t xml:space="preserve"> </w:t>
+      </w:r>
+      <w:r>
+        <w:rPr>
+          <w:rStyle w:val="VerbatimChar"/>
+        </w:rPr>
+        <w:t xml:space="preserve">.login-button { display: flex; justify-content: center; }</w:t>
+      </w:r>
+    </w:p>
+    <w:p>
+      <w:pPr>
+        <w:numPr>
+          <w:ilvl w:val="1"/>
+          <w:numId w:val="1020"/>
+        </w:numPr>
+        <w:pStyle w:val="Compact"/>
+      </w:pPr>
+      <w:r>
+        <w:t xml:space="preserve">Added media queries for mobile responsiveness</w:t>
+      </w:r>
+    </w:p>
+    <w:p>
+      <w:pPr>
+        <w:numPr>
+          <w:ilvl w:val="0"/>
+          <w:numId w:val="1019"/>
         </w:numPr>
         <w:pStyle w:val="Compact"/>
       </w:pPr>
@@ -2043,7 +2888,7 @@
         <w:t xml:space="preserve"> </w:t>
       </w:r>
       <w:r>
-        <w:t xml:space="preserve">✅ AI can verify the issue was solved</w:t>
+        <w:t xml:space="preserve">✅ AI can verify the issue was solved by actual code changes</w:t>
       </w:r>
     </w:p>
     <w:p>
@@ -2062,7 +2907,7 @@
       <w:pPr>
         <w:numPr>
           <w:ilvl w:val="0"/>
-          <w:numId w:val="1017"/>
+          <w:numId w:val="1021"/>
         </w:numPr>
         <w:pStyle w:val="Compact"/>
       </w:pPr>
@@ -2090,29 +2935,68 @@
       <w:pPr>
         <w:numPr>
           <w:ilvl w:val="0"/>
-          <w:numId w:val="1017"/>
-        </w:numPr>
-        <w:pStyle w:val="Compact"/>
-      </w:pPr>
-      <w:r>
-        <w:rPr>
-          <w:bCs/>
-          <w:b/>
-        </w:rPr>
-        <w:t xml:space="preserve">Changes:</w:t>
-      </w:r>
-      <w:r>
-        <w:t xml:space="preserve"> </w:t>
-      </w:r>
-      <w:r>
-        <w:t xml:space="preserve">Changed the button color and updated footer text</w:t>
-      </w:r>
-    </w:p>
-    <w:p>
-      <w:pPr>
-        <w:numPr>
-          <w:ilvl w:val="0"/>
-          <w:numId w:val="1017"/>
+          <w:numId w:val="1021"/>
+        </w:numPr>
+        <w:pStyle w:val="Compact"/>
+      </w:pPr>
+      <w:r>
+        <w:rPr>
+          <w:bCs/>
+          <w:b/>
+        </w:rPr>
+        <w:t xml:space="preserve">Code Changes (what the AI sees):</w:t>
+      </w:r>
+    </w:p>
+    <w:p>
+      <w:pPr>
+        <w:numPr>
+          <w:ilvl w:val="1"/>
+          <w:numId w:val="1022"/>
+        </w:numPr>
+        <w:pStyle w:val="Compact"/>
+      </w:pPr>
+      <w:r>
+        <w:t xml:space="preserve">Modified</w:t>
+      </w:r>
+      <w:r>
+        <w:t xml:space="preserve"> </w:t>
+      </w:r>
+      <w:r>
+        <w:rPr>
+          <w:rStyle w:val="VerbatimChar"/>
+        </w:rPr>
+        <w:t xml:space="preserve">components/Footer.jsx</w:t>
+      </w:r>
+    </w:p>
+    <w:p>
+      <w:pPr>
+        <w:numPr>
+          <w:ilvl w:val="1"/>
+          <w:numId w:val="1022"/>
+        </w:numPr>
+        <w:pStyle w:val="Compact"/>
+      </w:pPr>
+      <w:r>
+        <w:t xml:space="preserve">Changed button color from blue to green</w:t>
+      </w:r>
+    </w:p>
+    <w:p>
+      <w:pPr>
+        <w:numPr>
+          <w:ilvl w:val="1"/>
+          <w:numId w:val="1022"/>
+        </w:numPr>
+        <w:pStyle w:val="Compact"/>
+      </w:pPr>
+      <w:r>
+        <w:t xml:space="preserve">Updated footer text</w:t>
+      </w:r>
+    </w:p>
+    <w:p>
+      <w:pPr>
+        <w:numPr>
+          <w:ilvl w:val="0"/>
+          <w:numId w:val="1021"/>
         </w:numPr>
         <w:pStyle w:val="Compact"/>
       </w:pPr>
@@ -2127,11 +3011,150 @@
         <w:t xml:space="preserve"> </w:t>
       </w:r>
       <w:r>
-        <w:t xml:space="preserve">❌ AI cannot verify the actual issue was addressed</w:t>
-      </w:r>
-    </w:p>
-    <w:bookmarkEnd w:id="25"/>
-    <w:bookmarkStart w:id="26" w:name="X790779696b59349c01e10b60e054be0bdb73ae3"/>
+        <w:t xml:space="preserve">❌ AI sees that no code related to login button centering was changed</w:t>
+      </w:r>
+    </w:p>
+    <w:p>
+      <w:pPr>
+        <w:pStyle w:val="FirstParagraph"/>
+      </w:pPr>
+      <w:r>
+        <w:rPr>
+          <w:bCs/>
+          <w:b/>
+        </w:rPr>
+        <w:t xml:space="preserve">Example of TRYING TO CHEAT (doesn’t work!):</w:t>
+      </w:r>
+    </w:p>
+    <w:p>
+      <w:pPr>
+        <w:numPr>
+          <w:ilvl w:val="0"/>
+          <w:numId w:val="1023"/>
+        </w:numPr>
+        <w:pStyle w:val="Compact"/>
+      </w:pPr>
+      <w:r>
+        <w:rPr>
+          <w:bCs/>
+          <w:b/>
+        </w:rPr>
+        <w:t xml:space="preserve">Issue:</w:t>
+      </w:r>
+      <w:r>
+        <w:t xml:space="preserve"> </w:t>
+      </w:r>
+      <w:r>
+        <w:t xml:space="preserve">“</w:t>
+      </w:r>
+      <w:r>
+        <w:t xml:space="preserve">Login button is not centered on mobile devices</w:t>
+      </w:r>
+      <w:r>
+        <w:t xml:space="preserve">”</w:t>
+      </w:r>
+    </w:p>
+    <w:p>
+      <w:pPr>
+        <w:numPr>
+          <w:ilvl w:val="0"/>
+          <w:numId w:val="1023"/>
+        </w:numPr>
+        <w:pStyle w:val="Compact"/>
+      </w:pPr>
+      <w:r>
+        <w:rPr>
+          <w:bCs/>
+          <w:b/>
+        </w:rPr>
+        <w:t xml:space="preserve">PR Description:</w:t>
+      </w:r>
+      <w:r>
+        <w:t xml:space="preserve"> </w:t>
+      </w:r>
+      <w:r>
+        <w:t xml:space="preserve">“</w:t>
+      </w:r>
+      <w:r>
+        <w:t xml:space="preserve">Fixed the login button centering issue by updating CSS and adding mobile responsiveness</w:t>
+      </w:r>
+      <w:r>
+        <w:t xml:space="preserve">”</w:t>
+      </w:r>
+    </w:p>
+    <w:p>
+      <w:pPr>
+        <w:numPr>
+          <w:ilvl w:val="0"/>
+          <w:numId w:val="1023"/>
+        </w:numPr>
+        <w:pStyle w:val="Compact"/>
+      </w:pPr>
+      <w:r>
+        <w:rPr>
+          <w:bCs/>
+          <w:b/>
+        </w:rPr>
+        <w:t xml:space="preserve">Code Changes (what the AI actually sees):</w:t>
+      </w:r>
+    </w:p>
+    <w:p>
+      <w:pPr>
+        <w:numPr>
+          <w:ilvl w:val="1"/>
+          <w:numId w:val="1024"/>
+        </w:numPr>
+        <w:pStyle w:val="Compact"/>
+      </w:pPr>
+      <w:r>
+        <w:t xml:space="preserve">Modified</w:t>
+      </w:r>
+      <w:r>
+        <w:t xml:space="preserve"> </w:t>
+      </w:r>
+      <w:r>
+        <w:rPr>
+          <w:rStyle w:val="VerbatimChar"/>
+        </w:rPr>
+        <w:t xml:space="preserve">README.md</w:t>
+      </w:r>
+    </w:p>
+    <w:p>
+      <w:pPr>
+        <w:numPr>
+          <w:ilvl w:val="1"/>
+          <w:numId w:val="1024"/>
+        </w:numPr>
+        <w:pStyle w:val="Compact"/>
+      </w:pPr>
+      <w:r>
+        <w:t xml:space="preserve">Added one comment to an unrelated file</w:t>
+      </w:r>
+    </w:p>
+    <w:p>
+      <w:pPr>
+        <w:numPr>
+          <w:ilvl w:val="0"/>
+          <w:numId w:val="1023"/>
+        </w:numPr>
+        <w:pStyle w:val="Compact"/>
+      </w:pPr>
+      <w:r>
+        <w:rPr>
+          <w:bCs/>
+          <w:b/>
+        </w:rPr>
+        <w:t xml:space="preserve">Result:</w:t>
+      </w:r>
+      <w:r>
+        <w:t xml:space="preserve"> </w:t>
+      </w:r>
+      <w:r>
+        <w:t xml:space="preserve">❌ AI will FAIL this because it reads the actual code, not your description</w:t>
+      </w:r>
+    </w:p>
+    <w:bookmarkEnd w:id="28"/>
+    <w:bookmarkStart w:id="29" w:name="X790779696b59349c01e10b60e054be0bdb73ae3"/>
     <w:p>
       <w:pPr>
         <w:pStyle w:val="Heading3"/>
@@ -2156,7 +3179,7 @@
       <w:pPr>
         <w:numPr>
           <w:ilvl w:val="0"/>
-          <w:numId w:val="1018"/>
+          <w:numId w:val="1025"/>
         </w:numPr>
         <w:pStyle w:val="Compact"/>
       </w:pPr>
@@ -2168,7 +3191,7 @@
       <w:pPr>
         <w:numPr>
           <w:ilvl w:val="0"/>
-          <w:numId w:val="1018"/>
+          <w:numId w:val="1025"/>
         </w:numPr>
         <w:pStyle w:val="Compact"/>
       </w:pPr>
@@ -2180,7 +3203,7 @@
       <w:pPr>
         <w:numPr>
           <w:ilvl w:val="0"/>
-          <w:numId w:val="1018"/>
+          <w:numId w:val="1025"/>
         </w:numPr>
         <w:pStyle w:val="Compact"/>
       </w:pPr>
@@ -2204,7 +3227,7 @@
       <w:pPr>
         <w:numPr>
           <w:ilvl w:val="0"/>
-          <w:numId w:val="1019"/>
+          <w:numId w:val="1026"/>
         </w:numPr>
         <w:pStyle w:val="Compact"/>
       </w:pPr>
@@ -2216,7 +3239,7 @@
       <w:pPr>
         <w:numPr>
           <w:ilvl w:val="0"/>
-          <w:numId w:val="1019"/>
+          <w:numId w:val="1026"/>
         </w:numPr>
         <w:pStyle w:val="Compact"/>
       </w:pPr>
@@ -2228,7 +3251,7 @@
       <w:pPr>
         <w:numPr>
           <w:ilvl w:val="0"/>
-          <w:numId w:val="1019"/>
+          <w:numId w:val="1026"/>
         </w:numPr>
         <w:pStyle w:val="Compact"/>
       </w:pPr>
@@ -2252,7 +3275,7 @@
       <w:pPr>
         <w:numPr>
           <w:ilvl w:val="0"/>
-          <w:numId w:val="1020"/>
+          <w:numId w:val="1027"/>
         </w:numPr>
         <w:pStyle w:val="Compact"/>
       </w:pPr>
@@ -2264,7 +3287,7 @@
       <w:pPr>
         <w:numPr>
           <w:ilvl w:val="0"/>
-          <w:numId w:val="1020"/>
+          <w:numId w:val="1027"/>
         </w:numPr>
         <w:pStyle w:val="Compact"/>
       </w:pPr>
@@ -2276,7 +3299,7 @@
       <w:pPr>
         <w:numPr>
           <w:ilvl w:val="0"/>
-          <w:numId w:val="1020"/>
+          <w:numId w:val="1027"/>
         </w:numPr>
         <w:pStyle w:val="Compact"/>
       </w:pPr>
@@ -2284,8 +3307,8 @@
         <w:t xml:space="preserve">❌ Closing the PR without merging (this counts as not merged!)</w:t>
       </w:r>
     </w:p>
-    <w:bookmarkEnd w:id="26"/>
-    <w:bookmarkStart w:id="27" w:name="Xe8117be4a8680d0fbdf105adfc8ce4907d47c5e"/>
+    <w:bookmarkEnd w:id="29"/>
+    <w:bookmarkStart w:id="30" w:name="Xe8117be4a8680d0fbdf105adfc8ce4907d47c5e"/>
     <w:p>
       <w:pPr>
         <w:pStyle w:val="Heading3"/>
@@ -2328,7 +3351,7 @@
       <w:pPr>
         <w:numPr>
           <w:ilvl w:val="0"/>
-          <w:numId w:val="1021"/>
+          <w:numId w:val="1028"/>
         </w:numPr>
         <w:pStyle w:val="Compact"/>
       </w:pPr>
@@ -2356,7 +3379,7 @@
       <w:pPr>
         <w:numPr>
           <w:ilvl w:val="0"/>
-          <w:numId w:val="1021"/>
+          <w:numId w:val="1028"/>
         </w:numPr>
         <w:pStyle w:val="Compact"/>
       </w:pPr>
@@ -2368,7 +3391,7 @@
       <w:pPr>
         <w:numPr>
           <w:ilvl w:val="0"/>
-          <w:numId w:val="1021"/>
+          <w:numId w:val="1028"/>
         </w:numPr>
         <w:pStyle w:val="Compact"/>
       </w:pPr>
@@ -2422,7 +3445,7 @@
       <w:pPr>
         <w:numPr>
           <w:ilvl w:val="0"/>
-          <w:numId w:val="1022"/>
+          <w:numId w:val="1029"/>
         </w:numPr>
         <w:pStyle w:val="Compact"/>
       </w:pPr>
@@ -2444,7 +3467,7 @@
       <w:pPr>
         <w:numPr>
           <w:ilvl w:val="0"/>
-          <w:numId w:val="1022"/>
+          <w:numId w:val="1029"/>
         </w:numPr>
         <w:pStyle w:val="Compact"/>
       </w:pPr>
@@ -2454,6 +3477,50 @@
     </w:p>
     <w:p>
       <w:pPr>
+        <w:numPr>
+          <w:ilvl w:val="0"/>
+          <w:numId w:val="1029"/>
+        </w:numPr>
+        <w:pStyle w:val="Compact"/>
+      </w:pPr>
+      <w:r>
+        <w:rPr>
+          <w:bCs/>
+          <w:b/>
+        </w:rPr>
+        <w:t xml:space="preserve">This step is ONLY required for Team Grading</w:t>
+      </w:r>
+      <w:r>
+        <w:t xml:space="preserve"> </w:t>
+      </w:r>
+      <w:r>
+        <w:t xml:space="preserve">(single repository grading)</w:t>
+      </w:r>
+    </w:p>
+    <w:p>
+      <w:pPr>
+        <w:numPr>
+          <w:ilvl w:val="0"/>
+          <w:numId w:val="1029"/>
+        </w:numPr>
+        <w:pStyle w:val="Compact"/>
+      </w:pPr>
+      <w:r>
+        <w:rPr>
+          <w:bCs/>
+          <w:b/>
+        </w:rPr>
+        <w:t xml:space="preserve">If you’re being graded individually across multiple repositories, this criterion is skipped</w:t>
+      </w:r>
+      <w:r>
+        <w:t xml:space="preserve"> </w:t>
+      </w:r>
+      <w:r>
+        <w:t xml:space="preserve">- you won’t get these 10 points, but you also can’t lose them (max score is 90 instead of 100)</w:t>
+      </w:r>
+    </w:p>
+    <w:p>
+      <w:pPr>
         <w:pStyle w:val="FirstParagraph"/>
       </w:pPr>
       <w:r>
@@ -2468,7 +3535,7 @@
       <w:pPr>
         <w:numPr>
           <w:ilvl w:val="0"/>
-          <w:numId w:val="1023"/>
+          <w:numId w:val="1030"/>
         </w:numPr>
         <w:pStyle w:val="Compact"/>
       </w:pPr>
@@ -2480,7 +3547,7 @@
       <w:pPr>
         <w:numPr>
           <w:ilvl w:val="0"/>
-          <w:numId w:val="1023"/>
+          <w:numId w:val="1030"/>
         </w:numPr>
         <w:pStyle w:val="Compact"/>
       </w:pPr>
@@ -2492,7 +3559,7 @@
       <w:pPr>
         <w:numPr>
           <w:ilvl w:val="0"/>
-          <w:numId w:val="1023"/>
+          <w:numId w:val="1030"/>
         </w:numPr>
         <w:pStyle w:val="Compact"/>
       </w:pPr>
@@ -2545,9 +3612,9 @@
         <w:t xml:space="preserve">)</w:t>
       </w:r>
     </w:p>
-    <w:bookmarkEnd w:id="27"/>
-    <w:bookmarkEnd w:id="28"/>
-    <w:bookmarkStart w:id="29" w:name="date-range-considerations"/>
+    <w:bookmarkEnd w:id="30"/>
+    <w:bookmarkEnd w:id="31"/>
+    <w:bookmarkStart w:id="32" w:name="date-range-considerations"/>
     <w:p>
       <w:pPr>
         <w:pStyle w:val="Heading2"/>
@@ -2590,7 +3657,7 @@
       <w:pPr>
         <w:numPr>
           <w:ilvl w:val="0"/>
-          <w:numId w:val="1024"/>
+          <w:numId w:val="1031"/>
         </w:numPr>
         <w:pStyle w:val="Compact"/>
       </w:pPr>
@@ -2602,7 +3669,7 @@
       <w:pPr>
         <w:numPr>
           <w:ilvl w:val="0"/>
-          <w:numId w:val="1024"/>
+          <w:numId w:val="1031"/>
         </w:numPr>
         <w:pStyle w:val="Compact"/>
       </w:pPr>
@@ -2614,7 +3681,7 @@
       <w:pPr>
         <w:numPr>
           <w:ilvl w:val="0"/>
-          <w:numId w:val="1024"/>
+          <w:numId w:val="1031"/>
         </w:numPr>
         <w:pStyle w:val="Compact"/>
       </w:pPr>
@@ -2626,7 +3693,7 @@
       <w:pPr>
         <w:numPr>
           <w:ilvl w:val="0"/>
-          <w:numId w:val="1024"/>
+          <w:numId w:val="1031"/>
         </w:numPr>
         <w:pStyle w:val="Compact"/>
       </w:pPr>
@@ -2666,7 +3733,7 @@
       <w:pPr>
         <w:numPr>
           <w:ilvl w:val="0"/>
-          <w:numId w:val="1025"/>
+          <w:numId w:val="1032"/>
         </w:numPr>
         <w:pStyle w:val="Compact"/>
       </w:pPr>
@@ -2678,7 +3745,7 @@
       <w:pPr>
         <w:numPr>
           <w:ilvl w:val="0"/>
-          <w:numId w:val="1025"/>
+          <w:numId w:val="1032"/>
         </w:numPr>
         <w:pStyle w:val="Compact"/>
       </w:pPr>
@@ -2690,7 +3757,7 @@
       <w:pPr>
         <w:numPr>
           <w:ilvl w:val="0"/>
-          <w:numId w:val="1025"/>
+          <w:numId w:val="1032"/>
         </w:numPr>
         <w:pStyle w:val="Compact"/>
       </w:pPr>
@@ -2698,8 +3765,8 @@
         <w:t xml:space="preserve">Moving forward, complete all work within the current grading period</w:t>
       </w:r>
     </w:p>
-    <w:bookmarkEnd w:id="29"/>
-    <w:bookmarkStart w:id="30" w:name="quick-checklist"/>
+    <w:bookmarkEnd w:id="32"/>
+    <w:bookmarkStart w:id="33" w:name="quick-checklist"/>
     <w:p>
       <w:pPr>
         <w:pStyle w:val="Heading2"/>
@@ -2733,21 +3800,33 @@
     </w:p>
     <w:p>
       <w:pPr>
-        <w:numPr>
-          <w:ilvl w:val="0"/>
-          <w:numId w:val="1026"/>
-        </w:numPr>
-        <w:pStyle w:val="Compact"/>
-      </w:pPr>
-      <w:r>
-        <w:t xml:space="preserve">[ ] Issue is created and assigned to me</w:t>
-      </w:r>
-    </w:p>
-    <w:p>
-      <w:pPr>
-        <w:numPr>
-          <w:ilvl w:val="0"/>
-          <w:numId w:val="1026"/>
+        <w:pStyle w:val="BodyText"/>
+      </w:pPr>
+      <w:r>
+        <w:rPr>
+          <w:bCs/>
+          <w:b/>
+        </w:rPr>
+        <w:t xml:space="preserve">For Team Grading (Single Repository - 100 points):</w:t>
+      </w:r>
+    </w:p>
+    <w:p>
+      <w:pPr>
+        <w:numPr>
+          <w:ilvl w:val="0"/>
+          <w:numId w:val="1033"/>
+        </w:numPr>
+        <w:pStyle w:val="Compact"/>
+      </w:pPr>
+      <w:r>
+        <w:t xml:space="preserve">[ ] Issue is created and assigned to me (unless working in a docpacs repo)</w:t>
+      </w:r>
+    </w:p>
+    <w:p>
+      <w:pPr>
+        <w:numPr>
+          <w:ilvl w:val="0"/>
+          <w:numId w:val="1033"/>
         </w:numPr>
         <w:pStyle w:val="Compact"/>
       </w:pPr>
@@ -2759,7 +3838,7 @@
       <w:pPr>
         <w:numPr>
           <w:ilvl w:val="0"/>
-          <w:numId w:val="1026"/>
+          <w:numId w:val="1033"/>
         </w:numPr>
         <w:pStyle w:val="Compact"/>
       </w:pPr>
@@ -2783,7 +3862,7 @@
       <w:pPr>
         <w:numPr>
           <w:ilvl w:val="0"/>
-          <w:numId w:val="1026"/>
+          <w:numId w:val="1033"/>
         </w:numPr>
         <w:pStyle w:val="Compact"/>
       </w:pPr>
@@ -2813,7 +3892,7 @@
       <w:pPr>
         <w:numPr>
           <w:ilvl w:val="0"/>
-          <w:numId w:val="1026"/>
+          <w:numId w:val="1033"/>
         </w:numPr>
         <w:pStyle w:val="Compact"/>
       </w:pPr>
@@ -2825,7 +3904,7 @@
       <w:pPr>
         <w:numPr>
           <w:ilvl w:val="0"/>
-          <w:numId w:val="1026"/>
+          <w:numId w:val="1033"/>
         </w:numPr>
         <w:pStyle w:val="Compact"/>
       </w:pPr>
@@ -2837,7 +3916,7 @@
       <w:pPr>
         <w:numPr>
           <w:ilvl w:val="0"/>
-          <w:numId w:val="1026"/>
+          <w:numId w:val="1033"/>
         </w:numPr>
         <w:pStyle w:val="Compact"/>
       </w:pPr>
@@ -2849,7 +3928,7 @@
       <w:pPr>
         <w:numPr>
           <w:ilvl w:val="0"/>
-          <w:numId w:val="1026"/>
+          <w:numId w:val="1033"/>
         </w:numPr>
         <w:pStyle w:val="Compact"/>
       </w:pPr>
@@ -2861,7 +3940,7 @@
       <w:pPr>
         <w:numPr>
           <w:ilvl w:val="0"/>
-          <w:numId w:val="1026"/>
+          <w:numId w:val="1033"/>
         </w:numPr>
         <w:pStyle w:val="Compact"/>
       </w:pPr>
@@ -2873,7 +3952,7 @@
       <w:pPr>
         <w:numPr>
           <w:ilvl w:val="0"/>
-          <w:numId w:val="1026"/>
+          <w:numId w:val="1033"/>
         </w:numPr>
         <w:pStyle w:val="Compact"/>
       </w:pPr>
@@ -2885,7 +3964,7 @@
       <w:pPr>
         <w:numPr>
           <w:ilvl w:val="0"/>
-          <w:numId w:val="1026"/>
+          <w:numId w:val="1033"/>
         </w:numPr>
         <w:pStyle w:val="Compact"/>
       </w:pPr>
@@ -2897,7 +3976,7 @@
       <w:pPr>
         <w:numPr>
           <w:ilvl w:val="0"/>
-          <w:numId w:val="1026"/>
+          <w:numId w:val="1033"/>
         </w:numPr>
         <w:pStyle w:val="Compact"/>
       </w:pPr>
@@ -2927,7 +4006,7 @@
       <w:pPr>
         <w:numPr>
           <w:ilvl w:val="0"/>
-          <w:numId w:val="1026"/>
+          <w:numId w:val="1033"/>
         </w:numPr>
         <w:pStyle w:val="Compact"/>
       </w:pPr>
@@ -2935,8 +4014,152 @@
         <w:t xml:space="preserve">[ ] All of this was done within the current grading period</w:t>
       </w:r>
     </w:p>
-    <w:bookmarkEnd w:id="30"/>
-    <w:bookmarkStart w:id="34" w:name="common-scenarios"/>
+    <w:p>
+      <w:pPr>
+        <w:pStyle w:val="FirstParagraph"/>
+      </w:pPr>
+      <w:r>
+        <w:rPr>
+          <w:bCs/>
+          <w:b/>
+        </w:rPr>
+        <w:t xml:space="preserve">For Individual/Class Grading (Multiple Repositories - 90 points):</w:t>
+      </w:r>
+    </w:p>
+    <w:p>
+      <w:pPr>
+        <w:numPr>
+          <w:ilvl w:val="0"/>
+          <w:numId w:val="1034"/>
+        </w:numPr>
+        <w:pStyle w:val="Compact"/>
+      </w:pPr>
+      <w:r>
+        <w:t xml:space="preserve">[ ] Issue is created (assignment not required for docpacs repos)</w:t>
+      </w:r>
+    </w:p>
+    <w:p>
+      <w:pPr>
+        <w:numPr>
+          <w:ilvl w:val="0"/>
+          <w:numId w:val="1034"/>
+        </w:numPr>
+        <w:pStyle w:val="Compact"/>
+      </w:pPr>
+      <w:r>
+        <w:t xml:space="preserve">[ ] Issue has a clear, detailed description</w:t>
+      </w:r>
+    </w:p>
+    <w:p>
+      <w:pPr>
+        <w:numPr>
+          <w:ilvl w:val="0"/>
+          <w:numId w:val="1034"/>
+        </w:numPr>
+        <w:pStyle w:val="Compact"/>
+      </w:pPr>
+      <w:r>
+        <w:t xml:space="preserve">[ ] I created a branch for my work</w:t>
+      </w:r>
+    </w:p>
+    <w:p>
+      <w:pPr>
+        <w:numPr>
+          <w:ilvl w:val="0"/>
+          <w:numId w:val="1034"/>
+        </w:numPr>
+        <w:pStyle w:val="Compact"/>
+      </w:pPr>
+      <w:r>
+        <w:t xml:space="preserve">[ ] I made meaningful commits that reference the issue number</w:t>
+      </w:r>
+    </w:p>
+    <w:p>
+      <w:pPr>
+        <w:numPr>
+          <w:ilvl w:val="0"/>
+          <w:numId w:val="1034"/>
+        </w:numPr>
+        <w:pStyle w:val="Compact"/>
+      </w:pPr>
+      <w:r>
+        <w:t xml:space="preserve">[ ] I pushed my commits to GitHub</w:t>
+      </w:r>
+    </w:p>
+    <w:p>
+      <w:pPr>
+        <w:numPr>
+          <w:ilvl w:val="0"/>
+          <w:numId w:val="1034"/>
+        </w:numPr>
+        <w:pStyle w:val="Compact"/>
+      </w:pPr>
+      <w:r>
+        <w:t xml:space="preserve">[ ] I created a pull request that references the issue</w:t>
+      </w:r>
+    </w:p>
+    <w:p>
+      <w:pPr>
+        <w:numPr>
+          <w:ilvl w:val="0"/>
+          <w:numId w:val="1034"/>
+        </w:numPr>
+        <w:pStyle w:val="Compact"/>
+      </w:pPr>
+      <w:r>
+        <w:t xml:space="preserve">[ ] My PR description explains what I changed</w:t>
+      </w:r>
+    </w:p>
+    <w:p>
+      <w:pPr>
+        <w:numPr>
+          <w:ilvl w:val="0"/>
+          <w:numId w:val="1034"/>
+        </w:numPr>
+        <w:pStyle w:val="Compact"/>
+      </w:pPr>
+      <w:r>
+        <w:t xml:space="preserve">[ ] My code changes actually solve the problem described in the issue</w:t>
+      </w:r>
+    </w:p>
+    <w:p>
+      <w:pPr>
+        <w:numPr>
+          <w:ilvl w:val="0"/>
+          <w:numId w:val="1034"/>
+        </w:numPr>
+        <w:pStyle w:val="Compact"/>
+      </w:pPr>
+      <w:r>
+        <w:t xml:space="preserve">[ ] My pull request was reviewed and merged</w:t>
+      </w:r>
+    </w:p>
+    <w:p>
+      <w:pPr>
+        <w:numPr>
+          <w:ilvl w:val="0"/>
+          <w:numId w:val="1034"/>
+        </w:numPr>
+        <w:pStyle w:val="Compact"/>
+      </w:pPr>
+      <w:r>
+        <w:t xml:space="preserve">[ ] All of this was done within the current grading period</w:t>
+      </w:r>
+    </w:p>
+    <w:p>
+      <w:pPr>
+        <w:numPr>
+          <w:ilvl w:val="0"/>
+          <w:numId w:val="1034"/>
+        </w:numPr>
+        <w:pStyle w:val="Compact"/>
+      </w:pPr>
+      <w:r>
+        <w:t xml:space="preserve">[ ] Note: Project board workflow is not checked for individual grading</w:t>
+      </w:r>
+    </w:p>
+    <w:bookmarkEnd w:id="33"/>
+    <w:bookmarkStart w:id="38" w:name="common-scenarios"/>
     <w:p>
       <w:pPr>
         <w:pStyle w:val="Heading2"/>
@@ -2945,7 +4168,7 @@
         <w:t xml:space="preserve">Common Scenarios</w:t>
       </w:r>
     </w:p>
-    <w:bookmarkStart w:id="31" w:name="X849bd594b4f1ee79be300170b4c4848d00c41e5"/>
+    <w:bookmarkStart w:id="34" w:name="X849bd594b4f1ee79be300170b4c4848d00c41e5"/>
     <w:p>
       <w:pPr>
         <w:pStyle w:val="Heading3"/>
@@ -2982,7 +4205,7 @@
       <w:pPr>
         <w:numPr>
           <w:ilvl w:val="0"/>
-          <w:numId w:val="1027"/>
+          <w:numId w:val="1035"/>
         </w:numPr>
         <w:pStyle w:val="Compact"/>
       </w:pPr>
@@ -2994,7 +4217,7 @@
       <w:pPr>
         <w:numPr>
           <w:ilvl w:val="0"/>
-          <w:numId w:val="1027"/>
+          <w:numId w:val="1035"/>
         </w:numPr>
         <w:pStyle w:val="Compact"/>
       </w:pPr>
@@ -3006,7 +4229,7 @@
       <w:pPr>
         <w:numPr>
           <w:ilvl w:val="0"/>
-          <w:numId w:val="1027"/>
+          <w:numId w:val="1035"/>
         </w:numPr>
         <w:pStyle w:val="Compact"/>
       </w:pPr>
@@ -3018,7 +4241,7 @@
       <w:pPr>
         <w:numPr>
           <w:ilvl w:val="0"/>
-          <w:numId w:val="1027"/>
+          <w:numId w:val="1035"/>
         </w:numPr>
         <w:pStyle w:val="Compact"/>
       </w:pPr>
@@ -3042,7 +4265,7 @@
       <w:pPr>
         <w:numPr>
           <w:ilvl w:val="0"/>
-          <w:numId w:val="1028"/>
+          <w:numId w:val="1036"/>
         </w:numPr>
         <w:pStyle w:val="Compact"/>
       </w:pPr>
@@ -3054,7 +4277,7 @@
       <w:pPr>
         <w:numPr>
           <w:ilvl w:val="0"/>
-          <w:numId w:val="1028"/>
+          <w:numId w:val="1036"/>
         </w:numPr>
         <w:pStyle w:val="Compact"/>
       </w:pPr>
@@ -3066,7 +4289,7 @@
       <w:pPr>
         <w:numPr>
           <w:ilvl w:val="0"/>
-          <w:numId w:val="1028"/>
+          <w:numId w:val="1036"/>
         </w:numPr>
         <w:pStyle w:val="Compact"/>
       </w:pPr>
@@ -3078,7 +4301,7 @@
       <w:pPr>
         <w:numPr>
           <w:ilvl w:val="0"/>
-          <w:numId w:val="1028"/>
+          <w:numId w:val="1036"/>
         </w:numPr>
         <w:pStyle w:val="Compact"/>
       </w:pPr>
@@ -3086,8 +4309,8 @@
         <w:t xml:space="preserve">Make sure PRs from forks are submitted to the main repository</w:t>
       </w:r>
     </w:p>
-    <w:bookmarkEnd w:id="31"/>
-    <w:bookmarkStart w:id="32" w:name="X50ef282923353e81cc7e79475e54f1a3c6da734"/>
+    <w:bookmarkEnd w:id="34"/>
+    <w:bookmarkStart w:id="35" w:name="X50ef282923353e81cc7e79475e54f1a3c6da734"/>
     <w:p>
       <w:pPr>
         <w:pStyle w:val="Heading3"/>
@@ -3136,7 +4359,7 @@
       <w:pPr>
         <w:numPr>
           <w:ilvl w:val="0"/>
-          <w:numId w:val="1029"/>
+          <w:numId w:val="1037"/>
         </w:numPr>
         <w:pStyle w:val="Compact"/>
       </w:pPr>
@@ -3148,7 +4371,7 @@
       <w:pPr>
         <w:numPr>
           <w:ilvl w:val="0"/>
-          <w:numId w:val="1029"/>
+          <w:numId w:val="1037"/>
         </w:numPr>
         <w:pStyle w:val="Compact"/>
       </w:pPr>
@@ -3172,7 +4395,7 @@
       <w:pPr>
         <w:numPr>
           <w:ilvl w:val="0"/>
-          <w:numId w:val="1030"/>
+          <w:numId w:val="1038"/>
         </w:numPr>
         <w:pStyle w:val="Compact"/>
       </w:pPr>
@@ -3184,7 +4407,7 @@
       <w:pPr>
         <w:numPr>
           <w:ilvl w:val="0"/>
-          <w:numId w:val="1030"/>
+          <w:numId w:val="1038"/>
         </w:numPr>
         <w:pStyle w:val="Compact"/>
       </w:pPr>
@@ -3196,7 +4419,7 @@
       <w:pPr>
         <w:numPr>
           <w:ilvl w:val="0"/>
-          <w:numId w:val="1030"/>
+          <w:numId w:val="1038"/>
         </w:numPr>
         <w:pStyle w:val="Compact"/>
       </w:pPr>
@@ -3241,7 +4464,7 @@
       <w:pPr>
         <w:numPr>
           <w:ilvl w:val="0"/>
-          <w:numId w:val="1030"/>
+          <w:numId w:val="1038"/>
         </w:numPr>
         <w:pStyle w:val="Compact"/>
       </w:pPr>
@@ -3249,8 +4472,8 @@
         <w:t xml:space="preserve">Include comments in your code explaining what you fixed</w:t>
       </w:r>
     </w:p>
-    <w:bookmarkEnd w:id="32"/>
-    <w:bookmarkStart w:id="33" w:name="X39341d59220d9f9d1f8f0b78df93d45e31cbca5"/>
+    <w:bookmarkEnd w:id="35"/>
+    <w:bookmarkStart w:id="36" w:name="X39341d59220d9f9d1f8f0b78df93d45e31cbca5"/>
     <w:p>
       <w:pPr>
         <w:pStyle w:val="Heading3"/>
@@ -3299,7 +4522,7 @@
       <w:pPr>
         <w:numPr>
           <w:ilvl w:val="0"/>
-          <w:numId w:val="1031"/>
+          <w:numId w:val="1039"/>
         </w:numPr>
         <w:pStyle w:val="Compact"/>
       </w:pPr>
@@ -3311,7 +4534,7 @@
       <w:pPr>
         <w:numPr>
           <w:ilvl w:val="0"/>
-          <w:numId w:val="1031"/>
+          <w:numId w:val="1039"/>
         </w:numPr>
         <w:pStyle w:val="Compact"/>
       </w:pPr>
@@ -3323,7 +4546,7 @@
       <w:pPr>
         <w:numPr>
           <w:ilvl w:val="0"/>
-          <w:numId w:val="1031"/>
+          <w:numId w:val="1039"/>
         </w:numPr>
         <w:pStyle w:val="Compact"/>
       </w:pPr>
@@ -3333,6 +4556,28 @@
     </w:p>
     <w:p>
       <w:pPr>
+        <w:numPr>
+          <w:ilvl w:val="0"/>
+          <w:numId w:val="1039"/>
+        </w:numPr>
+        <w:pStyle w:val="Compact"/>
+      </w:pPr>
+      <w:r>
+        <w:rPr>
+          <w:bCs/>
+          <w:b/>
+        </w:rPr>
+        <w:t xml:space="preserve">Note:</w:t>
+      </w:r>
+      <w:r>
+        <w:t xml:space="preserve"> </w:t>
+      </w:r>
+      <w:r>
+        <w:t xml:space="preserve">If you’re being graded individually across multiple repos, this criterion is skipped (max score is 90, not 100)</w:t>
+      </w:r>
+    </w:p>
+    <w:p>
+      <w:pPr>
         <w:pStyle w:val="FirstParagraph"/>
       </w:pPr>
       <w:r>
@@ -3347,7 +4592,7 @@
       <w:pPr>
         <w:numPr>
           <w:ilvl w:val="0"/>
-          <w:numId w:val="1032"/>
+          <w:numId w:val="1040"/>
         </w:numPr>
         <w:pStyle w:val="Compact"/>
       </w:pPr>
@@ -3401,7 +4646,7 @@
       <w:pPr>
         <w:numPr>
           <w:ilvl w:val="0"/>
-          <w:numId w:val="1032"/>
+          <w:numId w:val="1040"/>
         </w:numPr>
         <w:pStyle w:val="Compact"/>
       </w:pPr>
@@ -3413,7 +4658,7 @@
       <w:pPr>
         <w:numPr>
           <w:ilvl w:val="0"/>
-          <w:numId w:val="1032"/>
+          <w:numId w:val="1040"/>
         </w:numPr>
         <w:pStyle w:val="Compact"/>
       </w:pPr>
@@ -3421,147 +4666,26 @@
         <w:t xml:space="preserve">Check the project board history to see which columns you actually used</w:t>
       </w:r>
     </w:p>
-    <w:bookmarkEnd w:id="33"/>
-    <w:bookmarkEnd w:id="34"/>
-    <w:bookmarkStart w:id="35" w:name="tips-for-success"/>
-    <w:p>
-      <w:pPr>
-        <w:pStyle w:val="Heading2"/>
-      </w:pPr>
-      <w:r>
-        <w:t xml:space="preserve">Tips for Success</w:t>
-      </w:r>
-    </w:p>
-    <w:p>
-      <w:pPr>
-        <w:numPr>
-          <w:ilvl w:val="0"/>
-          <w:numId w:val="1033"/>
-        </w:numPr>
-        <w:pStyle w:val="Compact"/>
-      </w:pPr>
-      <w:r>
-        <w:rPr>
-          <w:bCs/>
-          <w:b/>
-        </w:rPr>
-        <w:t xml:space="preserve">Be Specific:</w:t>
-      </w:r>
-      <w:r>
-        <w:t xml:space="preserve"> </w:t>
-      </w:r>
-      <w:r>
-        <w:t xml:space="preserve">Detailed issue descriptions help the AI understand what you’re supposed to accomplish</w:t>
-      </w:r>
-    </w:p>
-    <w:p>
-      <w:pPr>
-        <w:numPr>
-          <w:ilvl w:val="0"/>
-          <w:numId w:val="1033"/>
-        </w:numPr>
-        <w:pStyle w:val="Compact"/>
-      </w:pPr>
-      <w:r>
-        <w:rPr>
-          <w:bCs/>
-          <w:b/>
-        </w:rPr>
-        <w:t xml:space="preserve">Stay Consistent:</w:t>
-      </w:r>
-      <w:r>
-        <w:t xml:space="preserve"> </w:t>
-      </w:r>
-      <w:r>
-        <w:t xml:space="preserve">Use the same terminology in your issue, commits, PR, and code</w:t>
-      </w:r>
-    </w:p>
-    <w:p>
-      <w:pPr>
-        <w:numPr>
-          <w:ilvl w:val="0"/>
-          <w:numId w:val="1033"/>
-        </w:numPr>
-        <w:pStyle w:val="Compact"/>
-      </w:pPr>
-      <w:r>
-        <w:rPr>
-          <w:bCs/>
-          <w:b/>
-        </w:rPr>
-        <w:t xml:space="preserve">Document Everything:</w:t>
-      </w:r>
-      <w:r>
-        <w:t xml:space="preserve"> </w:t>
-      </w:r>
-      <w:r>
-        <w:t xml:space="preserve">Write clear commit messages and PR descriptions</w:t>
-      </w:r>
-    </w:p>
-    <w:p>
-      <w:pPr>
-        <w:numPr>
-          <w:ilvl w:val="0"/>
-          <w:numId w:val="1033"/>
-        </w:numPr>
-        <w:pStyle w:val="Compact"/>
-      </w:pPr>
-      <w:r>
-        <w:rPr>
-          <w:bCs/>
-          <w:b/>
-        </w:rPr>
-        <w:t xml:space="preserve">Follow the Workflow:</w:t>
-      </w:r>
-      <w:r>
-        <w:t xml:space="preserve"> </w:t>
-      </w:r>
-      <w:r>
-        <w:t xml:space="preserve">Don’t skip steps or try to combine them</w:t>
-      </w:r>
-    </w:p>
-    <w:p>
-      <w:pPr>
-        <w:numPr>
-          <w:ilvl w:val="0"/>
-          <w:numId w:val="1033"/>
-        </w:numPr>
-        <w:pStyle w:val="Compact"/>
-      </w:pPr>
-      <w:r>
-        <w:rPr>
-          <w:bCs/>
-          <w:b/>
-        </w:rPr>
-        <w:t xml:space="preserve">Work Within the Timeline:</w:t>
-      </w:r>
-      <w:r>
-        <w:t xml:space="preserve"> </w:t>
-      </w:r>
-      <w:r>
-        <w:t xml:space="preserve">Complete all work within the grading period</w:t>
-      </w:r>
-    </w:p>
-    <w:p>
-      <w:pPr>
-        <w:numPr>
-          <w:ilvl w:val="0"/>
-          <w:numId w:val="1033"/>
-        </w:numPr>
-        <w:pStyle w:val="Compact"/>
-      </w:pPr>
-      <w:r>
-        <w:rPr>
-          <w:bCs/>
-          <w:b/>
-        </w:rPr>
-        <w:t xml:space="preserve">Reference the Issue Number:</w:t>
-      </w:r>
-      <w:r>
-        <w:t xml:space="preserve"> </w:t>
-      </w:r>
-      <w:r>
-        <w:t xml:space="preserve">Always use</w:t>
+    <w:p>
+      <w:pPr>
+        <w:numPr>
+          <w:ilvl w:val="0"/>
+          <w:numId w:val="1040"/>
+        </w:numPr>
+        <w:pStyle w:val="Compact"/>
+      </w:pPr>
+      <w:r>
+        <w:t xml:space="preserve">If you’re being graded individually, remember that 90/90 is a perfect score (Project Board Workflow is not checked)</w:t>
+      </w:r>
+    </w:p>
+    <w:bookmarkEnd w:id="36"/>
+    <w:bookmarkStart w:id="37" w:name="X4d8ca3ae75b8e8246c9f40e2d5eed71fd686911"/>
+    <w:p>
+      <w:pPr>
+        <w:pStyle w:val="Heading3"/>
+      </w:pPr>
+      <w:r>
+        <w:t xml:space="preserve">Scenario 4:</w:t>
       </w:r>
       <w:r>
         <w:t xml:space="preserve"> </w:t>
@@ -3570,16 +4694,44 @@
         <w:t xml:space="preserve">“</w:t>
       </w:r>
       <w:r>
-        <w:t xml:space="preserve">Fixes #X</w:t>
+        <w:t xml:space="preserve">I’m working in a docpacs repo - do I need to assign issues?</w:t>
       </w:r>
       <w:r>
         <w:t xml:space="preserve">”</w:t>
       </w:r>
-      <w:r>
-        <w:t xml:space="preserve"> </w:t>
-      </w:r>
-      <w:r>
-        <w:t xml:space="preserve">or</w:t>
+    </w:p>
+    <w:p>
+      <w:pPr>
+        <w:pStyle w:val="FirstParagraph"/>
+      </w:pPr>
+      <w:r>
+        <w:rPr>
+          <w:bCs/>
+          <w:b/>
+        </w:rPr>
+        <w:t xml:space="preserve">Answer:</w:t>
+      </w:r>
+    </w:p>
+    <w:p>
+      <w:pPr>
+        <w:numPr>
+          <w:ilvl w:val="0"/>
+          <w:numId w:val="1041"/>
+        </w:numPr>
+        <w:pStyle w:val="Compact"/>
+      </w:pPr>
+      <w:r>
+        <w:rPr>
+          <w:bCs/>
+          <w:b/>
+        </w:rPr>
+        <w:t xml:space="preserve">No!</w:t>
+      </w:r>
+      <w:r>
+        <w:t xml:space="preserve"> </w:t>
+      </w:r>
+      <w:r>
+        <w:t xml:space="preserve">If you’re working in a repository whose name starts with</w:t>
       </w:r>
       <w:r>
         <w:t xml:space="preserve"> </w:t>
@@ -3588,7 +4740,7 @@
         <w:t xml:space="preserve">“</w:t>
       </w:r>
       <w:r>
-        <w:t xml:space="preserve">Closes #X</w:t>
+        <w:t xml:space="preserve">docpacs</w:t>
       </w:r>
       <w:r>
         <w:t xml:space="preserve">”</w:t>
@@ -3597,207 +4749,19 @@
         <w:t xml:space="preserve"> </w:t>
       </w:r>
       <w:r>
-        <w:t xml:space="preserve">in commits and PRs</w:t>
-      </w:r>
-    </w:p>
-    <w:p>
-      <w:pPr>
-        <w:numPr>
-          <w:ilvl w:val="0"/>
-          <w:numId w:val="1033"/>
-        </w:numPr>
-        <w:pStyle w:val="Compact"/>
-      </w:pPr>
-      <w:r>
-        <w:rPr>
-          <w:bCs/>
-          <w:b/>
-        </w:rPr>
-        <w:t xml:space="preserve">Test Your Work:</w:t>
-      </w:r>
-      <w:r>
-        <w:t xml:space="preserve"> </w:t>
-      </w:r>
-      <w:r>
-        <w:t xml:space="preserve">Make sure your changes actually work before submitting the PR</w:t>
-      </w:r>
-    </w:p>
-    <w:p>
-      <w:pPr>
-        <w:numPr>
-          <w:ilvl w:val="0"/>
-          <w:numId w:val="1033"/>
-        </w:numPr>
-        <w:pStyle w:val="Compact"/>
-      </w:pPr>
-      <w:r>
-        <w:rPr>
-          <w:bCs/>
-          <w:b/>
-        </w:rPr>
-        <w:t xml:space="preserve">Communicate:</w:t>
-      </w:r>
-      <w:r>
-        <w:t xml:space="preserve"> </w:t>
-      </w:r>
-      <w:r>
-        <w:t xml:space="preserve">If you’re unsure, ask your instructor before the grading deadline</w:t>
-      </w:r>
-    </w:p>
-    <w:bookmarkEnd w:id="35"/>
-    <w:bookmarkStart w:id="36" w:name="need-help"/>
-    <w:p>
-      <w:pPr>
-        <w:pStyle w:val="Heading2"/>
-      </w:pPr>
-      <w:r>
-        <w:t xml:space="preserve">Need Help?</w:t>
-      </w:r>
-    </w:p>
-    <w:p>
-      <w:pPr>
-        <w:pStyle w:val="FirstParagraph"/>
-      </w:pPr>
-      <w:r>
-        <w:t xml:space="preserve">If you’re having trouble getting a good score:</w:t>
-      </w:r>
-    </w:p>
-    <w:p>
-      <w:pPr>
-        <w:numPr>
-          <w:ilvl w:val="0"/>
-          <w:numId w:val="1034"/>
-        </w:numPr>
-        <w:pStyle w:val="Compact"/>
-      </w:pPr>
-      <w:r>
-        <w:t xml:space="preserve">Review this guide carefully</w:t>
-      </w:r>
-    </w:p>
-    <w:p>
-      <w:pPr>
-        <w:numPr>
-          <w:ilvl w:val="0"/>
-          <w:numId w:val="1034"/>
-        </w:numPr>
-        <w:pStyle w:val="Compact"/>
-      </w:pPr>
-      <w:r>
-        <w:t xml:space="preserve">Check the verbose console output from the grading bot (if your instructor provides it)</w:t>
-      </w:r>
-    </w:p>
-    <w:p>
-      <w:pPr>
-        <w:numPr>
-          <w:ilvl w:val="0"/>
-          <w:numId w:val="1034"/>
-        </w:numPr>
-        <w:pStyle w:val="Compact"/>
-      </w:pPr>
-      <w:r>
-        <w:t xml:space="preserve">Ask your instructor to verify your GitHub username and the date range</w:t>
-      </w:r>
-    </w:p>
-    <w:p>
-      <w:pPr>
-        <w:numPr>
-          <w:ilvl w:val="0"/>
-          <w:numId w:val="1034"/>
-        </w:numPr>
-        <w:pStyle w:val="Compact"/>
-      </w:pPr>
-      <w:r>
-        <w:t xml:space="preserve">Make sure you’re following all steps in order</w:t>
-      </w:r>
-    </w:p>
-    <w:p>
-      <w:pPr>
-        <w:numPr>
-          <w:ilvl w:val="0"/>
-          <w:numId w:val="1034"/>
-        </w:numPr>
-        <w:pStyle w:val="Compact"/>
-      </w:pPr>
-      <w:r>
-        <w:t xml:space="preserve">Compare your workflow with a classmate who got a high score</w:t>
-      </w:r>
-    </w:p>
-    <w:bookmarkEnd w:id="36"/>
-    <w:bookmarkStart w:id="37" w:name="summary"/>
-    <w:p>
-      <w:pPr>
-        <w:pStyle w:val="Heading2"/>
-      </w:pPr>
-      <w:r>
-        <w:t xml:space="preserve">Summary</w:t>
-      </w:r>
-    </w:p>
-    <w:p>
-      <w:pPr>
-        <w:pStyle w:val="FirstParagraph"/>
-      </w:pPr>
-      <w:r>
-        <w:t xml:space="preserve">Getting a perfect score is straightforward if you follow these steps:</w:t>
-      </w:r>
-    </w:p>
-    <w:p>
-      <w:pPr>
-        <w:numPr>
-          <w:ilvl w:val="0"/>
-          <w:numId w:val="1035"/>
-        </w:numPr>
-        <w:pStyle w:val="Compact"/>
-      </w:pPr>
-      <w:r>
-        <w:rPr>
-          <w:bCs/>
-          <w:b/>
-        </w:rPr>
-        <w:t xml:space="preserve">Create</w:t>
-      </w:r>
-      <w:r>
-        <w:t xml:space="preserve"> </w:t>
-      </w:r>
-      <w:r>
-        <w:t xml:space="preserve">a detailed issue and</w:t>
-      </w:r>
-      <w:r>
-        <w:t xml:space="preserve"> </w:t>
-      </w:r>
-      <w:r>
-        <w:rPr>
-          <w:bCs/>
-          <w:b/>
-        </w:rPr>
-        <w:t xml:space="preserve">assign</w:t>
-      </w:r>
-      <w:r>
-        <w:t xml:space="preserve"> </w:t>
-      </w:r>
-      <w:r>
-        <w:t xml:space="preserve">it to yourself</w:t>
-      </w:r>
-    </w:p>
-    <w:p>
-      <w:pPr>
-        <w:numPr>
-          <w:ilvl w:val="0"/>
-          <w:numId w:val="1035"/>
-        </w:numPr>
-        <w:pStyle w:val="Compact"/>
-      </w:pPr>
-      <w:r>
-        <w:rPr>
-          <w:bCs/>
-          <w:b/>
-        </w:rPr>
-        <w:t xml:space="preserve">Move</w:t>
-      </w:r>
-      <w:r>
-        <w:t xml:space="preserve"> </w:t>
-      </w:r>
-      <w:r>
-        <w:t xml:space="preserve">it to</w:t>
+        <w:t xml:space="preserve">(e.g.,</w:t>
+      </w:r>
+      <w:r>
+        <w:t xml:space="preserve"> </w:t>
+      </w:r>
+      <w:r>
+        <w:rPr>
+          <w:rStyle w:val="VerbatimChar"/>
+        </w:rPr>
+        <w:t xml:space="preserve">docpacs2526</w:t>
+      </w:r>
+      <w:r>
+        <w:t xml:space="preserve">), you automatically get full points for the</w:t>
       </w:r>
       <w:r>
         <w:t xml:space="preserve"> </w:t>
@@ -3806,7 +4770,7 @@
         <w:t xml:space="preserve">“</w:t>
       </w:r>
       <w:r>
-        <w:t xml:space="preserve">In Progress</w:t>
+        <w:t xml:space="preserve">Issue Assigned</w:t>
       </w:r>
       <w:r>
         <w:t xml:space="preserve">”</w:t>
@@ -3815,147 +4779,784 @@
         <w:t xml:space="preserve"> </w:t>
       </w:r>
       <w:r>
-        <w:t xml:space="preserve">on the project board</w:t>
-      </w:r>
-    </w:p>
-    <w:p>
-      <w:pPr>
-        <w:numPr>
-          <w:ilvl w:val="0"/>
-          <w:numId w:val="1035"/>
-        </w:numPr>
-        <w:pStyle w:val="Compact"/>
-      </w:pPr>
-      <w:r>
-        <w:rPr>
-          <w:bCs/>
-          <w:b/>
-        </w:rPr>
-        <w:t xml:space="preserve">Make</w:t>
-      </w:r>
-      <w:r>
-        <w:t xml:space="preserve"> </w:t>
-      </w:r>
-      <w:r>
-        <w:t xml:space="preserve">meaningful commits that reference the issue</w:t>
-      </w:r>
-    </w:p>
-    <w:p>
-      <w:pPr>
-        <w:numPr>
-          <w:ilvl w:val="0"/>
-          <w:numId w:val="1035"/>
-        </w:numPr>
-        <w:pStyle w:val="Compact"/>
-      </w:pPr>
-      <w:r>
-        <w:rPr>
-          <w:bCs/>
-          <w:b/>
-        </w:rPr>
-        <w:t xml:space="preserve">Create</w:t>
-      </w:r>
-      <w:r>
-        <w:t xml:space="preserve"> </w:t>
-      </w:r>
-      <w:r>
-        <w:t xml:space="preserve">a pull request that describes your changes</w:t>
-      </w:r>
-    </w:p>
-    <w:p>
-      <w:pPr>
-        <w:numPr>
-          <w:ilvl w:val="0"/>
-          <w:numId w:val="1035"/>
-        </w:numPr>
-        <w:pStyle w:val="Compact"/>
-      </w:pPr>
-      <w:r>
-        <w:rPr>
-          <w:bCs/>
-          <w:b/>
-        </w:rPr>
-        <w:t xml:space="preserve">Ensure</w:t>
-      </w:r>
-      <w:r>
-        <w:t xml:space="preserve"> </w:t>
-      </w:r>
-      <w:r>
-        <w:t xml:space="preserve">your work actually solves the stated problem</w:t>
-      </w:r>
-    </w:p>
-    <w:p>
-      <w:pPr>
-        <w:numPr>
-          <w:ilvl w:val="0"/>
-          <w:numId w:val="1035"/>
-        </w:numPr>
-        <w:pStyle w:val="Compact"/>
-      </w:pPr>
-      <w:r>
-        <w:rPr>
-          <w:bCs/>
-          <w:b/>
-        </w:rPr>
-        <w:t xml:space="preserve">Get</w:t>
-      </w:r>
-      <w:r>
-        <w:t xml:space="preserve"> </w:t>
-      </w:r>
-      <w:r>
-        <w:t xml:space="preserve">your pull request reviewed and merged</w:t>
-      </w:r>
-    </w:p>
-    <w:p>
-      <w:pPr>
-        <w:numPr>
-          <w:ilvl w:val="0"/>
-          <w:numId w:val="1035"/>
-        </w:numPr>
-        <w:pStyle w:val="Compact"/>
-      </w:pPr>
-      <w:r>
-        <w:rPr>
-          <w:bCs/>
-          <w:b/>
-        </w:rPr>
-        <w:t xml:space="preserve">Move</w:t>
-      </w:r>
-      <w:r>
-        <w:t xml:space="preserve"> </w:t>
-      </w:r>
-      <w:r>
-        <w:t xml:space="preserve">the issue to</w:t>
-      </w:r>
-      <w:r>
-        <w:t xml:space="preserve"> </w:t>
-      </w:r>
-      <w:r>
-        <w:t xml:space="preserve">“</w:t>
-      </w:r>
-      <w:r>
-        <w:t xml:space="preserve">Done</w:t>
-      </w:r>
-      <w:r>
-        <w:t xml:space="preserve">”</w:t>
-      </w:r>
-      <w:r>
-        <w:t xml:space="preserve"> </w:t>
-      </w:r>
-      <w:r>
-        <w:t xml:space="preserve">on the project board</w:t>
-      </w:r>
-    </w:p>
-    <w:p>
-      <w:pPr>
-        <w:pStyle w:val="FirstParagraph"/>
-      </w:pPr>
-      <w:r>
-        <w:t xml:space="preserve">Do all of this within the grading period, and you’ll get 100/100! 🎉</w:t>
+        <w:t xml:space="preserve">criterion, even if you don’t assign the issue to yourself.</w:t>
+      </w:r>
+    </w:p>
+    <w:p>
+      <w:pPr>
+        <w:numPr>
+          <w:ilvl w:val="0"/>
+          <w:numId w:val="1041"/>
+        </w:numPr>
+        <w:pStyle w:val="Compact"/>
+      </w:pPr>
+      <w:r>
+        <w:t xml:space="preserve">However, it’s still good practice to assign issues for clarity and organization.</w:t>
       </w:r>
     </w:p>
     <w:bookmarkEnd w:id="37"/>
     <w:bookmarkEnd w:id="38"/>
+    <w:bookmarkStart w:id="39" w:name="tips-for-success"/>
+    <w:p>
+      <w:pPr>
+        <w:pStyle w:val="Heading2"/>
+      </w:pPr>
+      <w:r>
+        <w:t xml:space="preserve">Tips for Success</w:t>
+      </w:r>
+    </w:p>
+    <w:p>
+      <w:pPr>
+        <w:numPr>
+          <w:ilvl w:val="0"/>
+          <w:numId w:val="1042"/>
+        </w:numPr>
+        <w:pStyle w:val="Compact"/>
+      </w:pPr>
+      <w:r>
+        <w:rPr>
+          <w:bCs/>
+          <w:b/>
+        </w:rPr>
+        <w:t xml:space="preserve">Be Specific:</w:t>
+      </w:r>
+      <w:r>
+        <w:t xml:space="preserve"> </w:t>
+      </w:r>
+      <w:r>
+        <w:t xml:space="preserve">Detailed issue descriptions help the AI understand what you’re supposed to accomplish</w:t>
+      </w:r>
+    </w:p>
+    <w:p>
+      <w:pPr>
+        <w:numPr>
+          <w:ilvl w:val="0"/>
+          <w:numId w:val="1042"/>
+        </w:numPr>
+        <w:pStyle w:val="Compact"/>
+      </w:pPr>
+      <w:r>
+        <w:rPr>
+          <w:bCs/>
+          <w:b/>
+        </w:rPr>
+        <w:t xml:space="preserve">Stay Consistent:</w:t>
+      </w:r>
+      <w:r>
+        <w:t xml:space="preserve"> </w:t>
+      </w:r>
+      <w:r>
+        <w:t xml:space="preserve">Use the same terminology in your issue, commits, PR, and code</w:t>
+      </w:r>
+    </w:p>
+    <w:p>
+      <w:pPr>
+        <w:numPr>
+          <w:ilvl w:val="0"/>
+          <w:numId w:val="1042"/>
+        </w:numPr>
+        <w:pStyle w:val="Compact"/>
+      </w:pPr>
+      <w:r>
+        <w:rPr>
+          <w:bCs/>
+          <w:b/>
+        </w:rPr>
+        <w:t xml:space="preserve">Document Everything:</w:t>
+      </w:r>
+      <w:r>
+        <w:t xml:space="preserve"> </w:t>
+      </w:r>
+      <w:r>
+        <w:t xml:space="preserve">Write clear commit messages and PR descriptions</w:t>
+      </w:r>
+    </w:p>
+    <w:p>
+      <w:pPr>
+        <w:numPr>
+          <w:ilvl w:val="0"/>
+          <w:numId w:val="1042"/>
+        </w:numPr>
+        <w:pStyle w:val="Compact"/>
+      </w:pPr>
+      <w:r>
+        <w:rPr>
+          <w:bCs/>
+          <w:b/>
+        </w:rPr>
+        <w:t xml:space="preserve">Follow the Workflow:</w:t>
+      </w:r>
+      <w:r>
+        <w:t xml:space="preserve"> </w:t>
+      </w:r>
+      <w:r>
+        <w:t xml:space="preserve">Don’t skip steps or try to combine them</w:t>
+      </w:r>
+    </w:p>
+    <w:p>
+      <w:pPr>
+        <w:numPr>
+          <w:ilvl w:val="0"/>
+          <w:numId w:val="1042"/>
+        </w:numPr>
+        <w:pStyle w:val="Compact"/>
+      </w:pPr>
+      <w:r>
+        <w:rPr>
+          <w:bCs/>
+          <w:b/>
+        </w:rPr>
+        <w:t xml:space="preserve">Work Within the Timeline:</w:t>
+      </w:r>
+      <w:r>
+        <w:t xml:space="preserve"> </w:t>
+      </w:r>
+      <w:r>
+        <w:t xml:space="preserve">Complete all work within the grading period</w:t>
+      </w:r>
+    </w:p>
+    <w:p>
+      <w:pPr>
+        <w:numPr>
+          <w:ilvl w:val="0"/>
+          <w:numId w:val="1042"/>
+        </w:numPr>
+        <w:pStyle w:val="Compact"/>
+      </w:pPr>
+      <w:r>
+        <w:rPr>
+          <w:bCs/>
+          <w:b/>
+        </w:rPr>
+        <w:t xml:space="preserve">Reference the Issue Number:</w:t>
+      </w:r>
+      <w:r>
+        <w:t xml:space="preserve"> </w:t>
+      </w:r>
+      <w:r>
+        <w:t xml:space="preserve">Always use</w:t>
+      </w:r>
+      <w:r>
+        <w:t xml:space="preserve"> </w:t>
+      </w:r>
+      <w:r>
+        <w:t xml:space="preserve">“</w:t>
+      </w:r>
+      <w:r>
+        <w:t xml:space="preserve">Fixes #X</w:t>
+      </w:r>
+      <w:r>
+        <w:t xml:space="preserve">”</w:t>
+      </w:r>
+      <w:r>
+        <w:t xml:space="preserve"> </w:t>
+      </w:r>
+      <w:r>
+        <w:t xml:space="preserve">or</w:t>
+      </w:r>
+      <w:r>
+        <w:t xml:space="preserve"> </w:t>
+      </w:r>
+      <w:r>
+        <w:t xml:space="preserve">“</w:t>
+      </w:r>
+      <w:r>
+        <w:t xml:space="preserve">Closes #X</w:t>
+      </w:r>
+      <w:r>
+        <w:t xml:space="preserve">”</w:t>
+      </w:r>
+      <w:r>
+        <w:t xml:space="preserve"> </w:t>
+      </w:r>
+      <w:r>
+        <w:t xml:space="preserve">in commits and PRs</w:t>
+      </w:r>
+    </w:p>
+    <w:p>
+      <w:pPr>
+        <w:numPr>
+          <w:ilvl w:val="0"/>
+          <w:numId w:val="1042"/>
+        </w:numPr>
+        <w:pStyle w:val="Compact"/>
+      </w:pPr>
+      <w:r>
+        <w:rPr>
+          <w:bCs/>
+          <w:b/>
+        </w:rPr>
+        <w:t xml:space="preserve">Test Your Work:</w:t>
+      </w:r>
+      <w:r>
+        <w:t xml:space="preserve"> </w:t>
+      </w:r>
+      <w:r>
+        <w:t xml:space="preserve">Make sure your changes actually work before submitting the PR</w:t>
+      </w:r>
+    </w:p>
+    <w:p>
+      <w:pPr>
+        <w:numPr>
+          <w:ilvl w:val="0"/>
+          <w:numId w:val="1042"/>
+        </w:numPr>
+        <w:pStyle w:val="Compact"/>
+      </w:pPr>
+      <w:r>
+        <w:rPr>
+          <w:bCs/>
+          <w:b/>
+        </w:rPr>
+        <w:t xml:space="preserve">Communicate:</w:t>
+      </w:r>
+      <w:r>
+        <w:t xml:space="preserve"> </w:t>
+      </w:r>
+      <w:r>
+        <w:t xml:space="preserve">If you’re unsure, ask your instructor before the grading deadline</w:t>
+      </w:r>
+    </w:p>
+    <w:bookmarkEnd w:id="39"/>
+    <w:bookmarkStart w:id="40" w:name="need-help"/>
+    <w:p>
+      <w:pPr>
+        <w:pStyle w:val="Heading2"/>
+      </w:pPr>
+      <w:r>
+        <w:t xml:space="preserve">Need Help?</w:t>
+      </w:r>
+    </w:p>
+    <w:p>
+      <w:pPr>
+        <w:pStyle w:val="FirstParagraph"/>
+      </w:pPr>
+      <w:r>
+        <w:t xml:space="preserve">If you’re having trouble getting a good score:</w:t>
+      </w:r>
+    </w:p>
+    <w:p>
+      <w:pPr>
+        <w:numPr>
+          <w:ilvl w:val="0"/>
+          <w:numId w:val="1043"/>
+        </w:numPr>
+        <w:pStyle w:val="Compact"/>
+      </w:pPr>
+      <w:r>
+        <w:t xml:space="preserve">Review this guide carefully</w:t>
+      </w:r>
+    </w:p>
+    <w:p>
+      <w:pPr>
+        <w:numPr>
+          <w:ilvl w:val="0"/>
+          <w:numId w:val="1043"/>
+        </w:numPr>
+        <w:pStyle w:val="Compact"/>
+      </w:pPr>
+      <w:r>
+        <w:t xml:space="preserve">Check the verbose console output from the grading bot (if your instructor provides it)</w:t>
+      </w:r>
+    </w:p>
+    <w:p>
+      <w:pPr>
+        <w:numPr>
+          <w:ilvl w:val="0"/>
+          <w:numId w:val="1043"/>
+        </w:numPr>
+        <w:pStyle w:val="Compact"/>
+      </w:pPr>
+      <w:r>
+        <w:t xml:space="preserve">Ask your instructor to verify your GitHub username and the date range</w:t>
+      </w:r>
+    </w:p>
+    <w:p>
+      <w:pPr>
+        <w:numPr>
+          <w:ilvl w:val="0"/>
+          <w:numId w:val="1043"/>
+        </w:numPr>
+        <w:pStyle w:val="Compact"/>
+      </w:pPr>
+      <w:r>
+        <w:t xml:space="preserve">Make sure you’re following all steps in order</w:t>
+      </w:r>
+    </w:p>
+    <w:p>
+      <w:pPr>
+        <w:numPr>
+          <w:ilvl w:val="0"/>
+          <w:numId w:val="1043"/>
+        </w:numPr>
+        <w:pStyle w:val="Compact"/>
+      </w:pPr>
+      <w:r>
+        <w:t xml:space="preserve">Compare your workflow with a classmate who got a high score</w:t>
+      </w:r>
+    </w:p>
+    <w:bookmarkEnd w:id="40"/>
+    <w:bookmarkStart w:id="43" w:name="summary"/>
+    <w:p>
+      <w:pPr>
+        <w:pStyle w:val="Heading2"/>
+      </w:pPr>
+      <w:r>
+        <w:t xml:space="preserve">Summary</w:t>
+      </w:r>
+    </w:p>
+    <w:p>
+      <w:pPr>
+        <w:pStyle w:val="FirstParagraph"/>
+      </w:pPr>
+      <w:r>
+        <w:t xml:space="preserve">Getting a perfect score is straightforward if you follow these steps:</w:t>
+      </w:r>
+    </w:p>
+    <w:bookmarkStart w:id="41" w:name="for-team-grading-100-points"/>
+    <w:p>
+      <w:pPr>
+        <w:pStyle w:val="Heading3"/>
+      </w:pPr>
+      <w:r>
+        <w:t xml:space="preserve">For Team Grading (100 points):</w:t>
+      </w:r>
+    </w:p>
+    <w:p>
+      <w:pPr>
+        <w:numPr>
+          <w:ilvl w:val="0"/>
+          <w:numId w:val="1044"/>
+        </w:numPr>
+        <w:pStyle w:val="Compact"/>
+      </w:pPr>
+      <w:r>
+        <w:rPr>
+          <w:bCs/>
+          <w:b/>
+        </w:rPr>
+        <w:t xml:space="preserve">Create</w:t>
+      </w:r>
+      <w:r>
+        <w:t xml:space="preserve"> </w:t>
+      </w:r>
+      <w:r>
+        <w:t xml:space="preserve">a detailed issue and</w:t>
+      </w:r>
+      <w:r>
+        <w:t xml:space="preserve"> </w:t>
+      </w:r>
+      <w:r>
+        <w:rPr>
+          <w:bCs/>
+          <w:b/>
+        </w:rPr>
+        <w:t xml:space="preserve">assign</w:t>
+      </w:r>
+      <w:r>
+        <w:t xml:space="preserve"> </w:t>
+      </w:r>
+      <w:r>
+        <w:t xml:space="preserve">it to yourself (unless in a docpacs repo)</w:t>
+      </w:r>
+    </w:p>
+    <w:p>
+      <w:pPr>
+        <w:numPr>
+          <w:ilvl w:val="0"/>
+          <w:numId w:val="1044"/>
+        </w:numPr>
+        <w:pStyle w:val="Compact"/>
+      </w:pPr>
+      <w:r>
+        <w:rPr>
+          <w:bCs/>
+          <w:b/>
+        </w:rPr>
+        <w:t xml:space="preserve">Move</w:t>
+      </w:r>
+      <w:r>
+        <w:t xml:space="preserve"> </w:t>
+      </w:r>
+      <w:r>
+        <w:t xml:space="preserve">it to</w:t>
+      </w:r>
+      <w:r>
+        <w:t xml:space="preserve"> </w:t>
+      </w:r>
+      <w:r>
+        <w:t xml:space="preserve">“</w:t>
+      </w:r>
+      <w:r>
+        <w:t xml:space="preserve">In Progress</w:t>
+      </w:r>
+      <w:r>
+        <w:t xml:space="preserve">”</w:t>
+      </w:r>
+      <w:r>
+        <w:t xml:space="preserve"> </w:t>
+      </w:r>
+      <w:r>
+        <w:t xml:space="preserve">on the project board</w:t>
+      </w:r>
+    </w:p>
+    <w:p>
+      <w:pPr>
+        <w:numPr>
+          <w:ilvl w:val="0"/>
+          <w:numId w:val="1044"/>
+        </w:numPr>
+        <w:pStyle w:val="Compact"/>
+      </w:pPr>
+      <w:r>
+        <w:rPr>
+          <w:bCs/>
+          <w:b/>
+        </w:rPr>
+        <w:t xml:space="preserve">Make</w:t>
+      </w:r>
+      <w:r>
+        <w:t xml:space="preserve"> </w:t>
+      </w:r>
+      <w:r>
+        <w:t xml:space="preserve">meaningful commits that reference the issue</w:t>
+      </w:r>
+    </w:p>
+    <w:p>
+      <w:pPr>
+        <w:numPr>
+          <w:ilvl w:val="0"/>
+          <w:numId w:val="1044"/>
+        </w:numPr>
+        <w:pStyle w:val="Compact"/>
+      </w:pPr>
+      <w:r>
+        <w:rPr>
+          <w:bCs/>
+          <w:b/>
+        </w:rPr>
+        <w:t xml:space="preserve">Create</w:t>
+      </w:r>
+      <w:r>
+        <w:t xml:space="preserve"> </w:t>
+      </w:r>
+      <w:r>
+        <w:t xml:space="preserve">a pull request that describes your changes</w:t>
+      </w:r>
+    </w:p>
+    <w:p>
+      <w:pPr>
+        <w:numPr>
+          <w:ilvl w:val="0"/>
+          <w:numId w:val="1044"/>
+        </w:numPr>
+        <w:pStyle w:val="Compact"/>
+      </w:pPr>
+      <w:r>
+        <w:rPr>
+          <w:bCs/>
+          <w:b/>
+        </w:rPr>
+        <w:t xml:space="preserve">Ensure</w:t>
+      </w:r>
+      <w:r>
+        <w:t xml:space="preserve"> </w:t>
+      </w:r>
+      <w:r>
+        <w:t xml:space="preserve">your work actually solves the stated problem</w:t>
+      </w:r>
+    </w:p>
+    <w:p>
+      <w:pPr>
+        <w:numPr>
+          <w:ilvl w:val="0"/>
+          <w:numId w:val="1044"/>
+        </w:numPr>
+        <w:pStyle w:val="Compact"/>
+      </w:pPr>
+      <w:r>
+        <w:rPr>
+          <w:bCs/>
+          <w:b/>
+        </w:rPr>
+        <w:t xml:space="preserve">Get</w:t>
+      </w:r>
+      <w:r>
+        <w:t xml:space="preserve"> </w:t>
+      </w:r>
+      <w:r>
+        <w:t xml:space="preserve">your pull request reviewed and merged</w:t>
+      </w:r>
+    </w:p>
+    <w:p>
+      <w:pPr>
+        <w:numPr>
+          <w:ilvl w:val="0"/>
+          <w:numId w:val="1044"/>
+        </w:numPr>
+        <w:pStyle w:val="Compact"/>
+      </w:pPr>
+      <w:r>
+        <w:rPr>
+          <w:bCs/>
+          <w:b/>
+        </w:rPr>
+        <w:t xml:space="preserve">Move</w:t>
+      </w:r>
+      <w:r>
+        <w:t xml:space="preserve"> </w:t>
+      </w:r>
+      <w:r>
+        <w:t xml:space="preserve">the issue to</w:t>
+      </w:r>
+      <w:r>
+        <w:t xml:space="preserve"> </w:t>
+      </w:r>
+      <w:r>
+        <w:t xml:space="preserve">“</w:t>
+      </w:r>
+      <w:r>
+        <w:t xml:space="preserve">Done</w:t>
+      </w:r>
+      <w:r>
+        <w:t xml:space="preserve">”</w:t>
+      </w:r>
+      <w:r>
+        <w:t xml:space="preserve"> </w:t>
+      </w:r>
+      <w:r>
+        <w:t xml:space="preserve">on the project board</w:t>
+      </w:r>
+    </w:p>
+    <w:p>
+      <w:pPr>
+        <w:pStyle w:val="FirstParagraph"/>
+      </w:pPr>
+      <w:r>
+        <w:t xml:space="preserve">Do all of this within the grading period, and you’ll get 100/100! 🎉</w:t>
+      </w:r>
+    </w:p>
+    <w:bookmarkEnd w:id="41"/>
+    <w:bookmarkStart w:id="42" w:name="for-individualclass-grading-90-points"/>
+    <w:p>
+      <w:pPr>
+        <w:pStyle w:val="Heading3"/>
+      </w:pPr>
+      <w:r>
+        <w:t xml:space="preserve">For Individual/Class Grading (90 points):</w:t>
+      </w:r>
+    </w:p>
+    <w:p>
+      <w:pPr>
+        <w:numPr>
+          <w:ilvl w:val="0"/>
+          <w:numId w:val="1045"/>
+        </w:numPr>
+        <w:pStyle w:val="Compact"/>
+      </w:pPr>
+      <w:r>
+        <w:rPr>
+          <w:bCs/>
+          <w:b/>
+        </w:rPr>
+        <w:t xml:space="preserve">Create</w:t>
+      </w:r>
+      <w:r>
+        <w:t xml:space="preserve"> </w:t>
+      </w:r>
+      <w:r>
+        <w:t xml:space="preserve">a detailed issue (assignment not required for docpacs repos)</w:t>
+      </w:r>
+    </w:p>
+    <w:p>
+      <w:pPr>
+        <w:numPr>
+          <w:ilvl w:val="0"/>
+          <w:numId w:val="1045"/>
+        </w:numPr>
+        <w:pStyle w:val="Compact"/>
+      </w:pPr>
+      <w:r>
+        <w:rPr>
+          <w:bCs/>
+          <w:b/>
+        </w:rPr>
+        <w:t xml:space="preserve">Make</w:t>
+      </w:r>
+      <w:r>
+        <w:t xml:space="preserve"> </w:t>
+      </w:r>
+      <w:r>
+        <w:t xml:space="preserve">meaningful commits that reference the issue</w:t>
+      </w:r>
+    </w:p>
+    <w:p>
+      <w:pPr>
+        <w:numPr>
+          <w:ilvl w:val="0"/>
+          <w:numId w:val="1045"/>
+        </w:numPr>
+        <w:pStyle w:val="Compact"/>
+      </w:pPr>
+      <w:r>
+        <w:rPr>
+          <w:bCs/>
+          <w:b/>
+        </w:rPr>
+        <w:t xml:space="preserve">Create</w:t>
+      </w:r>
+      <w:r>
+        <w:t xml:space="preserve"> </w:t>
+      </w:r>
+      <w:r>
+        <w:t xml:space="preserve">a pull request that describes your changes</w:t>
+      </w:r>
+    </w:p>
+    <w:p>
+      <w:pPr>
+        <w:numPr>
+          <w:ilvl w:val="0"/>
+          <w:numId w:val="1045"/>
+        </w:numPr>
+        <w:pStyle w:val="Compact"/>
+      </w:pPr>
+      <w:r>
+        <w:rPr>
+          <w:bCs/>
+          <w:b/>
+        </w:rPr>
+        <w:t xml:space="preserve">Ensure</w:t>
+      </w:r>
+      <w:r>
+        <w:t xml:space="preserve"> </w:t>
+      </w:r>
+      <w:r>
+        <w:t xml:space="preserve">your work actually solves the stated problem</w:t>
+      </w:r>
+    </w:p>
+    <w:p>
+      <w:pPr>
+        <w:numPr>
+          <w:ilvl w:val="0"/>
+          <w:numId w:val="1045"/>
+        </w:numPr>
+        <w:pStyle w:val="Compact"/>
+      </w:pPr>
+      <w:r>
+        <w:rPr>
+          <w:bCs/>
+          <w:b/>
+        </w:rPr>
+        <w:t xml:space="preserve">Get</w:t>
+      </w:r>
+      <w:r>
+        <w:t xml:space="preserve"> </w:t>
+      </w:r>
+      <w:r>
+        <w:t xml:space="preserve">your pull request reviewed and merged</w:t>
+      </w:r>
+    </w:p>
+    <w:p>
+      <w:pPr>
+        <w:pStyle w:val="FirstParagraph"/>
+      </w:pPr>
+      <w:r>
+        <w:t xml:space="preserve">Do all of this within the grading period, and you’ll get 90/90! 🎉</w:t>
+      </w:r>
+    </w:p>
+    <w:p>
+      <w:pPr>
+        <w:pStyle w:val="BodyText"/>
+      </w:pPr>
+      <w:r>
+        <w:rPr>
+          <w:bCs/>
+          <w:b/>
+        </w:rPr>
+        <w:t xml:space="preserve">Remember:</w:t>
+      </w:r>
+    </w:p>
+    <w:p>
+      <w:pPr>
+        <w:numPr>
+          <w:ilvl w:val="0"/>
+          <w:numId w:val="1046"/>
+        </w:numPr>
+        <w:pStyle w:val="Compact"/>
+      </w:pPr>
+      <w:r>
+        <w:t xml:space="preserve">Working in a</w:t>
+      </w:r>
+      <w:r>
+        <w:t xml:space="preserve"> </w:t>
+      </w:r>
+      <w:r>
+        <w:rPr>
+          <w:bCs/>
+          <w:b/>
+        </w:rPr>
+        <w:t xml:space="preserve">docpacs</w:t>
+      </w:r>
+      <w:r>
+        <w:t xml:space="preserve"> </w:t>
+      </w:r>
+      <w:r>
+        <w:t xml:space="preserve">repository? Issue assignment is automatically waived.</w:t>
+      </w:r>
+    </w:p>
+    <w:p>
+      <w:pPr>
+        <w:numPr>
+          <w:ilvl w:val="0"/>
+          <w:numId w:val="1046"/>
+        </w:numPr>
+        <w:pStyle w:val="Compact"/>
+      </w:pPr>
+      <w:r>
+        <w:t xml:space="preserve">Being graded</w:t>
+      </w:r>
+      <w:r>
+        <w:t xml:space="preserve"> </w:t>
+      </w:r>
+      <w:r>
+        <w:rPr>
+          <w:bCs/>
+          <w:b/>
+        </w:rPr>
+        <w:t xml:space="preserve">individually across multiple repos</w:t>
+      </w:r>
+      <w:r>
+        <w:t xml:space="preserve">? Project Board Workflow is not checked (max score is 90).</w:t>
+      </w:r>
+    </w:p>
+    <w:p>
+      <w:pPr>
+        <w:numPr>
+          <w:ilvl w:val="0"/>
+          <w:numId w:val="1046"/>
+        </w:numPr>
+        <w:pStyle w:val="Compact"/>
+      </w:pPr>
+      <w:r>
+        <w:t xml:space="preserve">Being graded as a</w:t>
+      </w:r>
+      <w:r>
+        <w:t xml:space="preserve"> </w:t>
+      </w:r>
+      <w:r>
+        <w:rPr>
+          <w:bCs/>
+          <w:b/>
+        </w:rPr>
+        <w:t xml:space="preserve">team in a single repo</w:t>
+      </w:r>
+      <w:r>
+        <w:t xml:space="preserve">? Follow all 7 steps for a perfect 100/100.</w:t>
+      </w:r>
+    </w:p>
+    <w:bookmarkEnd w:id="42"/>
+    <w:bookmarkEnd w:id="43"/>
+    <w:bookmarkEnd w:id="44"/>
     <w:sectPr/>
   </w:body>
 </w:document>
@@ -4260,42 +5861,45 @@
     <w:abstractNumId w:val="991"/>
   </w:num>
   <w:num w:numId="1003">
-    <w:abstractNumId w:val="991"/>
+    <w:abstractNumId w:val="99411"/>
+    <w:lvlOverride w:ilvl="0">
+      <w:startOverride w:val="1"/>
+    </w:lvlOverride>
+    <w:lvlOverride w:ilvl="1">
+      <w:startOverride w:val="1"/>
+    </w:lvlOverride>
+    <w:lvlOverride w:ilvl="2">
+      <w:startOverride w:val="1"/>
+    </w:lvlOverride>
+    <w:lvlOverride w:ilvl="3">
+      <w:startOverride w:val="1"/>
+    </w:lvlOverride>
+    <w:lvlOverride w:ilvl="4">
+      <w:startOverride w:val="1"/>
+    </w:lvlOverride>
+    <w:lvlOverride w:ilvl="5">
+      <w:startOverride w:val="1"/>
+    </w:lvlOverride>
+    <w:lvlOverride w:ilvl="6">
+      <w:startOverride w:val="1"/>
+    </w:lvlOverride>
+    <w:lvlOverride w:ilvl="7">
+      <w:startOverride w:val="1"/>
+    </w:lvlOverride>
+    <w:lvlOverride w:ilvl="8">
+      <w:startOverride w:val="1"/>
+    </w:lvlOverride>
   </w:num>
   <w:num w:numId="1004">
-    <w:abstractNumId w:val="99411"/>
-    <w:lvlOverride w:ilvl="0">
-      <w:startOverride w:val="1"/>
-    </w:lvlOverride>
-    <w:lvlOverride w:ilvl="1">
-      <w:startOverride w:val="1"/>
-    </w:lvlOverride>
-    <w:lvlOverride w:ilvl="2">
-      <w:startOverride w:val="1"/>
-    </w:lvlOverride>
-    <w:lvlOverride w:ilvl="3">
-      <w:startOverride w:val="1"/>
-    </w:lvlOverride>
-    <w:lvlOverride w:ilvl="4">
-      <w:startOverride w:val="1"/>
-    </w:lvlOverride>
-    <w:lvlOverride w:ilvl="5">
-      <w:startOverride w:val="1"/>
-    </w:lvlOverride>
-    <w:lvlOverride w:ilvl="6">
-      <w:startOverride w:val="1"/>
-    </w:lvlOverride>
-    <w:lvlOverride w:ilvl="7">
-      <w:startOverride w:val="1"/>
-    </w:lvlOverride>
-    <w:lvlOverride w:ilvl="8">
-      <w:startOverride w:val="1"/>
-    </w:lvlOverride>
+    <w:abstractNumId w:val="991"/>
   </w:num>
   <w:num w:numId="1005">
     <w:abstractNumId w:val="991"/>
   </w:num>
   <w:num w:numId="1006">
+    <w:abstractNumId w:val="991"/>
+  </w:num>
+  <w:num w:numId="1007">
     <w:abstractNumId w:val="99411"/>
     <w:lvlOverride w:ilvl="0">
       <w:startOverride w:val="1"/>
@@ -4324,9 +5928,6 @@
     <w:lvlOverride w:ilvl="8">
       <w:startOverride w:val="1"/>
     </w:lvlOverride>
-  </w:num>
-  <w:num w:numId="1007">
-    <w:abstractNumId w:val="991"/>
   </w:num>
   <w:num w:numId="1008">
     <w:abstractNumId w:val="991"/>
@@ -4362,40 +5963,40 @@
     </w:lvlOverride>
   </w:num>
   <w:num w:numId="1010">
-    <w:abstractNumId w:val="99411"/>
-    <w:lvlOverride w:ilvl="0">
-      <w:startOverride w:val="1"/>
-    </w:lvlOverride>
-    <w:lvlOverride w:ilvl="1">
-      <w:startOverride w:val="1"/>
-    </w:lvlOverride>
-    <w:lvlOverride w:ilvl="2">
-      <w:startOverride w:val="1"/>
-    </w:lvlOverride>
-    <w:lvlOverride w:ilvl="3">
-      <w:startOverride w:val="1"/>
-    </w:lvlOverride>
-    <w:lvlOverride w:ilvl="4">
-      <w:startOverride w:val="1"/>
-    </w:lvlOverride>
-    <w:lvlOverride w:ilvl="5">
-      <w:startOverride w:val="1"/>
-    </w:lvlOverride>
-    <w:lvlOverride w:ilvl="6">
-      <w:startOverride w:val="1"/>
-    </w:lvlOverride>
-    <w:lvlOverride w:ilvl="7">
-      <w:startOverride w:val="1"/>
-    </w:lvlOverride>
-    <w:lvlOverride w:ilvl="8">
-      <w:startOverride w:val="1"/>
-    </w:lvlOverride>
+    <w:abstractNumId w:val="991"/>
   </w:num>
   <w:num w:numId="1011">
     <w:abstractNumId w:val="991"/>
   </w:num>
   <w:num w:numId="1012">
-    <w:abstractNumId w:val="991"/>
+    <w:abstractNumId w:val="99411"/>
+    <w:lvlOverride w:ilvl="0">
+      <w:startOverride w:val="1"/>
+    </w:lvlOverride>
+    <w:lvlOverride w:ilvl="1">
+      <w:startOverride w:val="1"/>
+    </w:lvlOverride>
+    <w:lvlOverride w:ilvl="2">
+      <w:startOverride w:val="1"/>
+    </w:lvlOverride>
+    <w:lvlOverride w:ilvl="3">
+      <w:startOverride w:val="1"/>
+    </w:lvlOverride>
+    <w:lvlOverride w:ilvl="4">
+      <w:startOverride w:val="1"/>
+    </w:lvlOverride>
+    <w:lvlOverride w:ilvl="5">
+      <w:startOverride w:val="1"/>
+    </w:lvlOverride>
+    <w:lvlOverride w:ilvl="6">
+      <w:startOverride w:val="1"/>
+    </w:lvlOverride>
+    <w:lvlOverride w:ilvl="7">
+      <w:startOverride w:val="1"/>
+    </w:lvlOverride>
+    <w:lvlOverride w:ilvl="8">
+      <w:startOverride w:val="1"/>
+    </w:lvlOverride>
   </w:num>
   <w:num w:numId="1013">
     <w:abstractNumId w:val="99411"/>
@@ -4434,40 +6035,40 @@
     <w:abstractNumId w:val="991"/>
   </w:num>
   <w:num w:numId="1016">
-    <w:abstractNumId w:val="991"/>
+    <w:abstractNumId w:val="99411"/>
+    <w:lvlOverride w:ilvl="0">
+      <w:startOverride w:val="1"/>
+    </w:lvlOverride>
+    <w:lvlOverride w:ilvl="1">
+      <w:startOverride w:val="1"/>
+    </w:lvlOverride>
+    <w:lvlOverride w:ilvl="2">
+      <w:startOverride w:val="1"/>
+    </w:lvlOverride>
+    <w:lvlOverride w:ilvl="3">
+      <w:startOverride w:val="1"/>
+    </w:lvlOverride>
+    <w:lvlOverride w:ilvl="4">
+      <w:startOverride w:val="1"/>
+    </w:lvlOverride>
+    <w:lvlOverride w:ilvl="5">
+      <w:startOverride w:val="1"/>
+    </w:lvlOverride>
+    <w:lvlOverride w:ilvl="6">
+      <w:startOverride w:val="1"/>
+    </w:lvlOverride>
+    <w:lvlOverride w:ilvl="7">
+      <w:startOverride w:val="1"/>
+    </w:lvlOverride>
+    <w:lvlOverride w:ilvl="8">
+      <w:startOverride w:val="1"/>
+    </w:lvlOverride>
   </w:num>
   <w:num w:numId="1017">
     <w:abstractNumId w:val="991"/>
   </w:num>
   <w:num w:numId="1018">
-    <w:abstractNumId w:val="99411"/>
-    <w:lvlOverride w:ilvl="0">
-      <w:startOverride w:val="1"/>
-    </w:lvlOverride>
-    <w:lvlOverride w:ilvl="1">
-      <w:startOverride w:val="1"/>
-    </w:lvlOverride>
-    <w:lvlOverride w:ilvl="2">
-      <w:startOverride w:val="1"/>
-    </w:lvlOverride>
-    <w:lvlOverride w:ilvl="3">
-      <w:startOverride w:val="1"/>
-    </w:lvlOverride>
-    <w:lvlOverride w:ilvl="4">
-      <w:startOverride w:val="1"/>
-    </w:lvlOverride>
-    <w:lvlOverride w:ilvl="5">
-      <w:startOverride w:val="1"/>
-    </w:lvlOverride>
-    <w:lvlOverride w:ilvl="6">
-      <w:startOverride w:val="1"/>
-    </w:lvlOverride>
-    <w:lvlOverride w:ilvl="7">
-      <w:startOverride w:val="1"/>
-    </w:lvlOverride>
-    <w:lvlOverride w:ilvl="8">
-      <w:startOverride w:val="1"/>
-    </w:lvlOverride>
+    <w:abstractNumId w:val="991"/>
   </w:num>
   <w:num w:numId="1019">
     <w:abstractNumId w:val="991"/>
@@ -4476,34 +6077,7 @@
     <w:abstractNumId w:val="991"/>
   </w:num>
   <w:num w:numId="1021">
-    <w:abstractNumId w:val="99411"/>
-    <w:lvlOverride w:ilvl="0">
-      <w:startOverride w:val="1"/>
-    </w:lvlOverride>
-    <w:lvlOverride w:ilvl="1">
-      <w:startOverride w:val="1"/>
-    </w:lvlOverride>
-    <w:lvlOverride w:ilvl="2">
-      <w:startOverride w:val="1"/>
-    </w:lvlOverride>
-    <w:lvlOverride w:ilvl="3">
-      <w:startOverride w:val="1"/>
-    </w:lvlOverride>
-    <w:lvlOverride w:ilvl="4">
-      <w:startOverride w:val="1"/>
-    </w:lvlOverride>
-    <w:lvlOverride w:ilvl="5">
-      <w:startOverride w:val="1"/>
-    </w:lvlOverride>
-    <w:lvlOverride w:ilvl="6">
-      <w:startOverride w:val="1"/>
-    </w:lvlOverride>
-    <w:lvlOverride w:ilvl="7">
-      <w:startOverride w:val="1"/>
-    </w:lvlOverride>
-    <w:lvlOverride w:ilvl="8">
-      <w:startOverride w:val="1"/>
-    </w:lvlOverride>
+    <w:abstractNumId w:val="991"/>
   </w:num>
   <w:num w:numId="1022">
     <w:abstractNumId w:val="991"/>
@@ -4515,7 +6089,34 @@
     <w:abstractNumId w:val="991"/>
   </w:num>
   <w:num w:numId="1025">
-    <w:abstractNumId w:val="991"/>
+    <w:abstractNumId w:val="99411"/>
+    <w:lvlOverride w:ilvl="0">
+      <w:startOverride w:val="1"/>
+    </w:lvlOverride>
+    <w:lvlOverride w:ilvl="1">
+      <w:startOverride w:val="1"/>
+    </w:lvlOverride>
+    <w:lvlOverride w:ilvl="2">
+      <w:startOverride w:val="1"/>
+    </w:lvlOverride>
+    <w:lvlOverride w:ilvl="3">
+      <w:startOverride w:val="1"/>
+    </w:lvlOverride>
+    <w:lvlOverride w:ilvl="4">
+      <w:startOverride w:val="1"/>
+    </w:lvlOverride>
+    <w:lvlOverride w:ilvl="5">
+      <w:startOverride w:val="1"/>
+    </w:lvlOverride>
+    <w:lvlOverride w:ilvl="6">
+      <w:startOverride w:val="1"/>
+    </w:lvlOverride>
+    <w:lvlOverride w:ilvl="7">
+      <w:startOverride w:val="1"/>
+    </w:lvlOverride>
+    <w:lvlOverride w:ilvl="8">
+      <w:startOverride w:val="1"/>
+    </w:lvlOverride>
   </w:num>
   <w:num w:numId="1026">
     <w:abstractNumId w:val="991"/>
@@ -4524,7 +6125,34 @@
     <w:abstractNumId w:val="991"/>
   </w:num>
   <w:num w:numId="1028">
-    <w:abstractNumId w:val="991"/>
+    <w:abstractNumId w:val="99411"/>
+    <w:lvlOverride w:ilvl="0">
+      <w:startOverride w:val="1"/>
+    </w:lvlOverride>
+    <w:lvlOverride w:ilvl="1">
+      <w:startOverride w:val="1"/>
+    </w:lvlOverride>
+    <w:lvlOverride w:ilvl="2">
+      <w:startOverride w:val="1"/>
+    </w:lvlOverride>
+    <w:lvlOverride w:ilvl="3">
+      <w:startOverride w:val="1"/>
+    </w:lvlOverride>
+    <w:lvlOverride w:ilvl="4">
+      <w:startOverride w:val="1"/>
+    </w:lvlOverride>
+    <w:lvlOverride w:ilvl="5">
+      <w:startOverride w:val="1"/>
+    </w:lvlOverride>
+    <w:lvlOverride w:ilvl="6">
+      <w:startOverride w:val="1"/>
+    </w:lvlOverride>
+    <w:lvlOverride w:ilvl="7">
+      <w:startOverride w:val="1"/>
+    </w:lvlOverride>
+    <w:lvlOverride w:ilvl="8">
+      <w:startOverride w:val="1"/>
+    </w:lvlOverride>
   </w:num>
   <w:num w:numId="1029">
     <w:abstractNumId w:val="991"/>
@@ -4539,6 +6167,33 @@
     <w:abstractNumId w:val="991"/>
   </w:num>
   <w:num w:numId="1033">
+    <w:abstractNumId w:val="991"/>
+  </w:num>
+  <w:num w:numId="1034">
+    <w:abstractNumId w:val="991"/>
+  </w:num>
+  <w:num w:numId="1035">
+    <w:abstractNumId w:val="991"/>
+  </w:num>
+  <w:num w:numId="1036">
+    <w:abstractNumId w:val="991"/>
+  </w:num>
+  <w:num w:numId="1037">
+    <w:abstractNumId w:val="991"/>
+  </w:num>
+  <w:num w:numId="1038">
+    <w:abstractNumId w:val="991"/>
+  </w:num>
+  <w:num w:numId="1039">
+    <w:abstractNumId w:val="991"/>
+  </w:num>
+  <w:num w:numId="1040">
+    <w:abstractNumId w:val="991"/>
+  </w:num>
+  <w:num w:numId="1041">
+    <w:abstractNumId w:val="991"/>
+  </w:num>
+  <w:num w:numId="1042">
     <w:abstractNumId w:val="99411"/>
     <w:lvlOverride w:ilvl="0">
       <w:startOverride w:val="1"/>
@@ -4568,7 +6223,7 @@
       <w:startOverride w:val="1"/>
     </w:lvlOverride>
   </w:num>
-  <w:num w:numId="1034">
+  <w:num w:numId="1043">
     <w:abstractNumId w:val="99411"/>
     <w:lvlOverride w:ilvl="0">
       <w:startOverride w:val="1"/>
@@ -4598,7 +6253,7 @@
       <w:startOverride w:val="1"/>
     </w:lvlOverride>
   </w:num>
-  <w:num w:numId="1035">
+  <w:num w:numId="1044">
     <w:abstractNumId w:val="99411"/>
     <w:lvlOverride w:ilvl="0">
       <w:startOverride w:val="1"/>
@@ -4627,6 +6282,39 @@
     <w:lvlOverride w:ilvl="8">
       <w:startOverride w:val="1"/>
     </w:lvlOverride>
+  </w:num>
+  <w:num w:numId="1045">
+    <w:abstractNumId w:val="99411"/>
+    <w:lvlOverride w:ilvl="0">
+      <w:startOverride w:val="1"/>
+    </w:lvlOverride>
+    <w:lvlOverride w:ilvl="1">
+      <w:startOverride w:val="1"/>
+    </w:lvlOverride>
+    <w:lvlOverride w:ilvl="2">
+      <w:startOverride w:val="1"/>
+    </w:lvlOverride>
+    <w:lvlOverride w:ilvl="3">
+      <w:startOverride w:val="1"/>
+    </w:lvlOverride>
+    <w:lvlOverride w:ilvl="4">
+      <w:startOverride w:val="1"/>
+    </w:lvlOverride>
+    <w:lvlOverride w:ilvl="5">
+      <w:startOverride w:val="1"/>
+    </w:lvlOverride>
+    <w:lvlOverride w:ilvl="6">
+      <w:startOverride w:val="1"/>
+    </w:lvlOverride>
+    <w:lvlOverride w:ilvl="7">
+      <w:startOverride w:val="1"/>
+    </w:lvlOverride>
+    <w:lvlOverride w:ilvl="8">
+      <w:startOverride w:val="1"/>
+    </w:lvlOverride>
+  </w:num>
+  <w:num w:numId="1046">
+    <w:abstractNumId w:val="991"/>
   </w:num>
 </w:numbering>
 </file>

</xml_diff>